<commit_message>
Apply review fixes and add the 25 October resume and CV
Use one mission wording ("in decisions that rest on data") and end it
with a clause backed by public work. Label the safety review as not
validated with author sign-off pending, say the 18 seeded defects were
registered in advance and are not a detection rate, and credit
established error seeding and the standard C-QTc hysteresis check
first. Put the A false floor title in sentence case to match the
latest Zenodo version, here and in RESEARCH_MAP.md.

Replace the careers/ resume and CV (PDF and Word) with the 25 October
versions, which have no dated independent entry. The CV is now 5
pages, so the README link label and careers/README.md say so;
careers/README.md also drops its em dashes and shows the new date.

Co-Authored-By: Claude Opus 5.5 <noreply@anthropic.com>
</commit_message>
<xml_diff>
--- a/careers/Patrick_Iben_CV.docx
+++ b/careers/Patrick_Iben_CV.docx
@@ -79,7 +79,7 @@
       <w:pPr/>
       <w:r>
         <w:rPr/>
-        <w:t>Applied mathematician and biostatistician with seven years of clinical biostatistics in contract research and twelve years in research. Develops statistical frameworks and inspectable software across clinical biometrics, AI evaluation, wearable sensing and public-data monitoring. Independent work connects model validation and reproducibility with scientific software, interactive demonstrations and educational companions. Open to full-time and consulting roles in research science, research engineering, AI evaluation, biostatistical methods and decision-support systems.</w:t>
+        <w:t>Applied mathematician and biostatistician with seven years of clinical biostatistics in contract research and twelve years in research. Works to eliminate needless ambiguity, risk, and suffering in decisions that rest on data, by stating in advance how a claim could fail and reporting exactly what was measured and what was not. Develops statistical frameworks and inspectable software across clinical biometrics, AI evaluation, wearable sensing and public-data monitoring. Independent work connects model validation and reproducibility with scientific software, interactive demonstrations and educational companions. Open to full-time and consulting roles in research science, research engineering, AI evaluation, biostatistical methods and decision-support systems.</w:t>
       </w:r>
     </w:p>
     <w:p>
@@ -431,7 +431,318 @@
     <w:p>
       <w:pPr>
         <w:pStyle w:val="Heading1"/>
-        <w:pageBreakBefore/>
+      </w:pPr>
+      <w:r>
+        <w:rPr/>
+        <w:t>Clinical biometrics portfolio (synthetic data)</w:t>
+      </w:r>
+    </w:p>
+    <w:p>
+      <w:pPr>
+        <w:pStyle w:val="Entry"/>
+      </w:pPr>
+      <w:r>
+        <w:rPr>
+          <w:b/>
+        </w:rPr>
+        <w:t>Clinical trial biostatistics portfolio</w:t>
+      </w:r>
+      <w:r>
+        <w:rPr/>
+        <w:t xml:space="preserve"> | </w:t>
+      </w:r>
+      <w:hyperlink r:id="rId2">
+        <w:r>
+          <w:rPr>
+            <w:color w:val="000000"/>
+          </w:rPr>
+          <w:t>Source</w:t>
+        </w:r>
+      </w:hyperlink>
+    </w:p>
+    <w:p>
+      <w:pPr>
+        <w:pStyle w:val="Bullet"/>
+        <w:numPr>
+          <w:ilvl w:val="0"/>
+          <w:numId w:val="1027"/>
+        </w:numPr>
+        <w:ind w:left="202" w:hanging="202"/>
+      </w:pPr>
+      <w:r>
+        <w:rPr/>
+        <w:t xml:space="preserve">Built an end-to-end </w:t>
+      </w:r>
+      <w:hyperlink r:id="rId3">
+        <w:r>
+          <w:rPr>
+            <w:color w:val="154D66"/>
+          </w:rPr>
+          <w:t>worked bioequivalence study</w:t>
+        </w:r>
+      </w:hyperlink>
+      <w:r>
+        <w:rPr/>
+        <w:t xml:space="preserve"> on synthetic data (2x2 crossover, N = 40), from PowerTOST sample size and randomization through an ICH E9(R1) estimand and SAP, admiral ADaM, PKNCA noncompartmental analysis, the ICH M13A model, rtables/tern TLFs and CSR Section 11-style text. One script regenerates every output and CI reruns it. QC is an executed same-author re-derivation (79 NCA profiles, 0 mismatches), not independent double programming; define.xml, Pinnacle 21 and SAS are not covered.</w:t>
+      </w:r>
+    </w:p>
+    <w:p>
+      <w:pPr>
+        <w:pStyle w:val="Bullet"/>
+        <w:numPr>
+          <w:ilvl w:val="0"/>
+          <w:numId w:val="1027"/>
+        </w:numPr>
+        <w:ind w:left="202" w:hanging="202"/>
+      </w:pPr>
+      <w:r>
+        <w:rPr/>
+        <w:t xml:space="preserve">Implemented </w:t>
+      </w:r>
+      <w:hyperlink r:id="rId16">
+        <w:r>
+          <w:rPr>
+            <w:color w:val="154D66"/>
+          </w:rPr>
+          <w:t>safety-review screening rules</w:t>
+        </w:r>
+      </w:hyperlink>
+      <w:r>
+        <w:rPr/>
+        <w:t xml:space="preserve"> for a synthetic first-in-human dose-escalation study: potential Hy's Law per the 2009 FDA DILI guidance, with a 30-day window as an SAP convention; confirmation flags for ALT or AST above 3x ULN; ICH E14 QTcF categories; and a worst-of roll-up. Built a Safety Review Committee packet, a Shiny console and a 12-cell Hy's Law convention-sensitivity grid; 215 expectations in 42 tests pass. Not validated, not reviewed by a medical monitor, and author sign-off pending.</w:t>
+      </w:r>
+    </w:p>
+    <w:p>
+      <w:pPr>
+        <w:pStyle w:val="Bullet"/>
+        <w:numPr>
+          <w:ilvl w:val="0"/>
+          <w:numId w:val="1027"/>
+        </w:numPr>
+        <w:ind w:left="202" w:hanging="202"/>
+      </w:pPr>
+      <w:r>
+        <w:rPr/>
+        <w:t>Developed 221 ADaM-based TLF pseudocode programs per language in SAS and R for parallel, crossover, single-sequence, SAD and MAD designs. The SAS programs are not executed; the R programs are parse-checked, not run on data.</w:t>
+      </w:r>
+    </w:p>
+    <w:p>
+      <w:pPr>
+        <w:pStyle w:val="Bullet"/>
+        <w:numPr>
+          <w:ilvl w:val="0"/>
+          <w:numId w:val="1027"/>
+        </w:numPr>
+        <w:ind w:left="202" w:hanging="202"/>
+      </w:pPr>
+      <w:r>
+        <w:rPr/>
+        <w:t>Built an eight-domain synthetic ADaM sandbox with one-compartment oral PK/NCA and a 2-by-2 bioequivalence crossover ANOVA that regenerates its committed outputs byte for byte.</w:t>
+      </w:r>
+    </w:p>
+    <w:p>
+      <w:pPr>
+        <w:pStyle w:val="Bullet"/>
+        <w:numPr>
+          <w:ilvl w:val="0"/>
+          <w:numId w:val="1027"/>
+        </w:numPr>
+        <w:ind w:left="202" w:hanging="202"/>
+      </w:pPr>
+      <w:r>
+        <w:rPr/>
+        <w:t xml:space="preserve">Built a </w:t>
+      </w:r>
+      <w:hyperlink r:id="rId17">
+        <w:r>
+          <w:rPr>
+            <w:color w:val="154D66"/>
+          </w:rPr>
+          <w:t>ten-gate QC harness</w:t>
+        </w:r>
+      </w:hyperlink>
+      <w:r>
+        <w:rPr/>
+        <w:t xml:space="preserve"> for the portfolio. A same-author recomputation of the PK sandbox's 80 profiles by a second route agreed within a maximum relative difference of 4.4e-10. Applied established error seeding, adapted from the teeth check in the Consilience Engine software: of 18 pre-registered seeded defects, 14 were caught, 1 survived, 1 was equivalent and 2 were not applicable (counts for this list, not a detection rate). Only the recomputation gate caught the seven numeric and counting defects. Human sign-off is pending on every gate.</w:t>
+      </w:r>
+    </w:p>
+    <w:p>
+      <w:pPr>
+        <w:pStyle w:val="Bullet"/>
+        <w:numPr>
+          <w:ilvl w:val="0"/>
+          <w:numId w:val="1027"/>
+        </w:numPr>
+        <w:ind w:left="202" w:hanging="202"/>
+      </w:pPr>
+      <w:r>
+        <w:rPr/>
+        <w:t>Developed numeric-provenance checks for TLF interpretation (the language-model step is a stub) and custom structural dataset checks (not Pinnacle 21 or CDISC CORE).</w:t>
+      </w:r>
+    </w:p>
+    <w:p>
+      <w:pPr>
+        <w:pStyle w:val="Bullet"/>
+        <w:numPr>
+          <w:ilvl w:val="0"/>
+          <w:numId w:val="1027"/>
+        </w:numPr>
+        <w:ind w:left="202" w:hanging="202"/>
+      </w:pPr>
+      <w:r>
+        <w:rPr/>
+        <w:t xml:space="preserve">Ran an exploratory, ADEMP-reported </w:t>
+      </w:r>
+      <w:hyperlink r:id="rId18">
+        <w:r>
+          <w:rPr>
+            <w:color w:val="154D66"/>
+          </w:rPr>
+          <w:t>residual-carryover simulation</w:t>
+        </w:r>
+      </w:hyperlink>
+      <w:r>
+        <w:rPr/>
+        <w:t xml:space="preserve"> of the ICH M13A 5% pre-dose rule in a synthetic 2x2 design (n = 24). With a two-half-life washout, naive consumer risk at a true GMR of 1.25 was 0.318 versus 0.051 without residual drug; at five half-lives the rule excluded 34% of participants, unevenly by sequence. The design follows the cluster randomized trial simulation study.</w:t>
+      </w:r>
+    </w:p>
+    <w:p>
+      <w:pPr>
+        <w:pStyle w:val="Bullet"/>
+        <w:numPr>
+          <w:ilvl w:val="0"/>
+          <w:numId w:val="1027"/>
+        </w:numPr>
+        <w:ind w:left="202" w:hanging="202"/>
+      </w:pPr>
+      <w:r>
+        <w:rPr/>
+        <w:t xml:space="preserve">Formalized the standard C-QTc hysteresis check as an exploratory, prespecified test on the established </w:t>
+      </w:r>
+      <w:hyperlink r:id="rId19">
+        <w:r>
+          <w:rPr>
+            <w:color w:val="154D66"/>
+          </w:rPr>
+          <w:t>signed loop area</w:t>
+        </w:r>
+      </w:hyperlink>
+      <w:r>
+        <w:rPr/>
+        <w:t>, with a standard error that allows for the shared time-matched placebo mean. Across 32 synthetic scenarios of 1,000 replicates its size was 0.046, while a one-sample sign-flip test over-rejected (up to 0.236) when the placebo mean was shared. Added SAD/MAD mock shells in SAS and R (SAS not executed); the framing follows the directed-contagion manuscript.</w:t>
+      </w:r>
+    </w:p>
+    <w:p>
+      <w:pPr>
+        <w:pStyle w:val="Bullet"/>
+        <w:numPr>
+          <w:ilvl w:val="0"/>
+          <w:numId w:val="1027"/>
+        </w:numPr>
+        <w:ind w:left="202" w:hanging="202"/>
+      </w:pPr>
+      <w:r>
+        <w:rPr/>
+        <w:t>Made three R Shiny apps (safety review, IRT/RTSM acceptance tracking and study lifecycle monitoring) run in the browser with Shinylive on bundled synthetic data, checked in Chrome only. Built an IRT/RTSM user-acceptance test library with traceability and release criteria and a coverage and continuity toolkit that runs in the browser; the SAS/R monitoring macros are not executed.</w:t>
+      </w:r>
+    </w:p>
+    <w:p>
+      <w:pPr>
+        <w:pStyle w:val="Entry"/>
+      </w:pPr>
+      <w:hyperlink r:id="rId20">
+        <w:r>
+          <w:rPr>
+            <w:color w:val="000000"/>
+            <w:b/>
+          </w:rPr>
+          <w:t>eCRF pipeline applications</w:t>
+        </w:r>
+      </w:hyperlink>
+      <w:r>
+        <w:rPr/>
+        <w:t xml:space="preserve"> | </w:t>
+      </w:r>
+      <w:hyperlink r:id="rId21">
+        <w:r>
+          <w:rPr>
+            <w:color w:val="000000"/>
+          </w:rPr>
+          <w:t>Demo overview</w:t>
+        </w:r>
+      </w:hyperlink>
+      <w:r>
+        <w:rPr/>
+        <w:t xml:space="preserve"> | </w:t>
+      </w:r>
+      <w:hyperlink r:id="rId22">
+        <w:r>
+          <w:rPr>
+            <w:color w:val="000000"/>
+          </w:rPr>
+          <w:t>Evaluation</w:t>
+        </w:r>
+      </w:hyperlink>
+    </w:p>
+    <w:p>
+      <w:pPr>
+        <w:pStyle w:val="Bullet"/>
+        <w:numPr>
+          <w:ilvl w:val="0"/>
+          <w:numId w:val="1027"/>
+        </w:numPr>
+        <w:ind w:left="202" w:hanging="202"/>
+      </w:pPr>
+      <w:r>
+        <w:rPr/>
+        <w:t>Built four Python (Streamlit) apps: Coding QC assist, De-identification review assist, Participant risk screening and Central statistical monitoring. All four also run in the browser (stlite) on bundled synthetic data with uploads disabled; the model path runs only locally.</w:t>
+      </w:r>
+    </w:p>
+    <w:p>
+      <w:pPr>
+        <w:pStyle w:val="Bullet"/>
+        <w:numPr>
+          <w:ilvl w:val="0"/>
+          <w:numId w:val="1027"/>
+        </w:numPr>
+        <w:ind w:left="202" w:hanging="202"/>
+      </w:pPr>
+      <w:r>
+        <w:rPr/>
+        <w:t>Separated deterministic stand-ins from optional model, Sinkhorn and Isolation Forest paths; public demonstrations and evaluations use synthetic data and placeholder dictionary codes, not MedDRA.</w:t>
+      </w:r>
+    </w:p>
+    <w:p>
+      <w:pPr>
+        <w:pStyle w:val="Bullet"/>
+        <w:numPr>
+          <w:ilvl w:val="0"/>
+          <w:numId w:val="1027"/>
+        </w:numPr>
+        <w:ind w:left="202" w:hanging="202"/>
+      </w:pPr>
+      <w:r>
+        <w:rPr/>
+        <w:t>Logged input hashes, configuration, paths and thresholds for traceable reruns with retained inputs and software/model artifacts; provided runnable QC.</w:t>
+      </w:r>
+    </w:p>
+    <w:p>
+      <w:pPr>
+        <w:pStyle w:val="Bullet"/>
+        <w:numPr>
+          <w:ilvl w:val="0"/>
+          <w:numId w:val="1027"/>
+        </w:numPr>
+        <w:ind w:left="202" w:hanging="202"/>
+      </w:pPr>
+      <w:r>
+        <w:rPr/>
+        <w:t>Published measured failure rates on synthetic held-out data: the de-identification stand-in left 108 of 308 identifiers readable (model path 91 of 308), and the coding stand-in ranked the right term first for 54.2% of verbatims (model path 77.8%). A pre-registered within-sibling check, adapted from the AlphaGenome within-site audit, routed both sibling-term families to human coding because neither family cleared the pre-registered 0.90 accuracy floor once uncertainty was counted and the tool was not shown to beat a keyword rule.</w:t>
+      </w:r>
+    </w:p>
+    <w:p>
+      <w:pPr>
+        <w:pStyle w:val="Heading1"/>
       </w:pPr>
       <w:r>
         <w:rPr/>
@@ -502,7 +813,7 @@
         <w:pStyle w:val="LinkLine"/>
         <w:ind w:left="202"/>
       </w:pPr>
-      <w:hyperlink r:id="rId2">
+      <w:hyperlink r:id="rId23">
         <w:r>
           <w:rPr>
             <w:color w:val="154D66"/>
@@ -514,7 +825,7 @@
         <w:rPr/>
         <w:t xml:space="preserve"> | </w:t>
       </w:r>
-      <w:hyperlink r:id="rId3">
+      <w:hyperlink r:id="rId24">
         <w:r>
           <w:rPr>
             <w:color w:val="154D66"/>
@@ -526,7 +837,7 @@
         <w:rPr/>
         <w:t xml:space="preserve"> | </w:t>
       </w:r>
-      <w:hyperlink r:id="rId16">
+      <w:hyperlink r:id="rId25">
         <w:r>
           <w:rPr>
             <w:color w:val="154D66"/>
@@ -538,7 +849,7 @@
         <w:rPr/>
         <w:t xml:space="preserve"> | </w:t>
       </w:r>
-      <w:hyperlink r:id="rId17">
+      <w:hyperlink r:id="rId26">
         <w:r>
           <w:rPr>
             <w:color w:val="154D66"/>
@@ -592,7 +903,7 @@
         <w:pStyle w:val="LinkLine"/>
         <w:ind w:left="202"/>
       </w:pPr>
-      <w:hyperlink r:id="rId18">
+      <w:hyperlink r:id="rId27">
         <w:r>
           <w:rPr>
             <w:color w:val="154D66"/>
@@ -604,7 +915,7 @@
         <w:rPr/>
         <w:t xml:space="preserve"> | </w:t>
       </w:r>
-      <w:hyperlink r:id="rId19">
+      <w:hyperlink r:id="rId28">
         <w:r>
           <w:rPr>
             <w:color w:val="154D66"/>
@@ -616,7 +927,7 @@
         <w:rPr/>
         <w:t xml:space="preserve"> | </w:t>
       </w:r>
-      <w:hyperlink r:id="rId20">
+      <w:hyperlink r:id="rId29">
         <w:r>
           <w:rPr>
             <w:color w:val="154D66"/>
@@ -628,7 +939,7 @@
         <w:rPr/>
         <w:t xml:space="preserve"> | </w:t>
       </w:r>
-      <w:hyperlink r:id="rId21">
+      <w:hyperlink r:id="rId30">
         <w:r>
           <w:rPr>
             <w:color w:val="154D66"/>
@@ -645,7 +956,7 @@
         <w:rPr>
           <w:b/>
         </w:rPr>
-        <w:t>A False Floor: Refuting Our Own Information-Limit Claim in a Lethal Identification Task.</w:t>
+        <w:t>A false floor: Refuting our own information-limit claim in a lethal identification task.</w:t>
       </w:r>
       <w:r>
         <w:rPr/>
@@ -672,7 +983,7 @@
         <w:pStyle w:val="LinkLine"/>
         <w:ind w:left="202"/>
       </w:pPr>
-      <w:hyperlink r:id="rId22">
+      <w:hyperlink r:id="rId31">
         <w:r>
           <w:rPr>
             <w:color w:val="154D66"/>
@@ -684,7 +995,7 @@
         <w:rPr/>
         <w:t xml:space="preserve"> | </w:t>
       </w:r>
-      <w:hyperlink r:id="rId23">
+      <w:hyperlink r:id="rId32">
         <w:r>
           <w:rPr>
             <w:color w:val="154D66"/>
@@ -696,7 +1007,7 @@
         <w:rPr/>
         <w:t xml:space="preserve"> | </w:t>
       </w:r>
-      <w:hyperlink r:id="rId24">
+      <w:hyperlink r:id="rId33">
         <w:r>
           <w:rPr>
             <w:color w:val="154D66"/>
@@ -750,7 +1061,7 @@
         <w:pStyle w:val="LinkLine"/>
         <w:ind w:left="202"/>
       </w:pPr>
-      <w:hyperlink r:id="rId25">
+      <w:hyperlink r:id="rId34">
         <w:r>
           <w:rPr>
             <w:color w:val="154D66"/>
@@ -762,7 +1073,7 @@
         <w:rPr/>
         <w:t xml:space="preserve"> | </w:t>
       </w:r>
-      <w:hyperlink r:id="rId26">
+      <w:hyperlink r:id="rId35">
         <w:r>
           <w:rPr>
             <w:color w:val="154D66"/>
@@ -774,7 +1085,7 @@
         <w:rPr/>
         <w:t xml:space="preserve"> | </w:t>
       </w:r>
-      <w:hyperlink r:id="rId27">
+      <w:hyperlink r:id="rId36">
         <w:r>
           <w:rPr>
             <w:color w:val="154D66"/>
@@ -786,7 +1097,7 @@
         <w:rPr/>
         <w:t xml:space="preserve"> | </w:t>
       </w:r>
-      <w:hyperlink r:id="rId28">
+      <w:hyperlink r:id="rId37">
         <w:r>
           <w:rPr>
             <w:color w:val="154D66"/>
@@ -840,7 +1151,7 @@
         <w:pStyle w:val="LinkLine"/>
         <w:ind w:left="202"/>
       </w:pPr>
-      <w:hyperlink r:id="rId29">
+      <w:hyperlink r:id="rId38">
         <w:r>
           <w:rPr>
             <w:color w:val="154D66"/>
@@ -852,7 +1163,7 @@
         <w:rPr/>
         <w:t xml:space="preserve"> | </w:t>
       </w:r>
-      <w:hyperlink r:id="rId30">
+      <w:hyperlink r:id="rId39">
         <w:r>
           <w:rPr>
             <w:color w:val="154D66"/>
@@ -864,7 +1175,7 @@
         <w:rPr/>
         <w:t xml:space="preserve"> | </w:t>
       </w:r>
-      <w:hyperlink r:id="rId31">
+      <w:hyperlink r:id="rId40">
         <w:r>
           <w:rPr>
             <w:color w:val="154D66"/>
@@ -908,7 +1219,7 @@
         <w:pStyle w:val="LinkLine"/>
         <w:ind w:left="202"/>
       </w:pPr>
-      <w:hyperlink r:id="rId32">
+      <w:hyperlink r:id="rId41">
         <w:r>
           <w:rPr>
             <w:color w:val="154D66"/>
@@ -920,7 +1231,7 @@
         <w:rPr/>
         <w:t xml:space="preserve"> | </w:t>
       </w:r>
-      <w:hyperlink r:id="rId33">
+      <w:hyperlink r:id="rId42">
         <w:r>
           <w:rPr>
             <w:color w:val="154D66"/>
@@ -932,7 +1243,7 @@
         <w:rPr/>
         <w:t xml:space="preserve"> | </w:t>
       </w:r>
-      <w:hyperlink r:id="rId34">
+      <w:hyperlink r:id="rId43">
         <w:r>
           <w:rPr>
             <w:color w:val="154D66"/>
@@ -1007,7 +1318,6 @@
     <w:p>
       <w:pPr>
         <w:pStyle w:val="Heading1"/>
-        <w:pageBreakBefore/>
       </w:pPr>
       <w:r>
         <w:rPr/>
@@ -1018,7 +1328,7 @@
       <w:pPr>
         <w:pStyle w:val="Entry"/>
       </w:pPr>
-      <w:hyperlink r:id="rId35">
+      <w:hyperlink r:id="rId44">
         <w:r>
           <w:rPr>
             <w:color w:val="000000"/>
@@ -1031,7 +1341,7 @@
         <w:rPr/>
         <w:t xml:space="preserve"> | </w:t>
       </w:r>
-      <w:hyperlink r:id="rId36">
+      <w:hyperlink r:id="rId45">
         <w:r>
           <w:rPr>
             <w:color w:val="000000"/>
@@ -1051,7 +1361,7 @@
       </w:pPr>
       <w:r>
         <w:rPr/>
-        <w:t>Built 32 self-contained browser consoles spanning hazards, infrastructure, healthcare, public health and markets. Examples include river-flood propagation, earthquake consequences, U.S. grid strain, NHS Scotland hospital strain, CDC surveillance and the World Bank global-health atlas.</w:t>
+        <w:t>Built 32 self-contained browser consoles spanning hazards, infrastructure, health-system strain, public health, access to care and markets. Examples include river-flood propagation, earthquake consequences, U.S. grid strain, NHS Scotland hospital strain, CDC surveillance and the World Bank global-health atlas.</w:t>
       </w:r>
     </w:p>
     <w:p>
@@ -1100,7 +1410,7 @@
       <w:pPr>
         <w:pStyle w:val="Entry"/>
       </w:pPr>
-      <w:hyperlink r:id="rId37">
+      <w:hyperlink r:id="rId46">
         <w:r>
           <w:rPr>
             <w:color w:val="000000"/>
@@ -1170,7 +1480,7 @@
       <w:pPr>
         <w:pStyle w:val="Entry"/>
       </w:pPr>
-      <w:hyperlink r:id="rId38">
+      <w:hyperlink r:id="rId47">
         <w:r>
           <w:rPr>
             <w:color w:val="000000"/>
@@ -1183,7 +1493,7 @@
         <w:rPr/>
         <w:t xml:space="preserve"> | </w:t>
       </w:r>
-      <w:hyperlink r:id="rId39">
+      <w:hyperlink r:id="rId48">
         <w:r>
           <w:rPr>
             <w:color w:val="000000"/>
@@ -1233,7 +1543,7 @@
         <w:rPr/>
         <w:t xml:space="preserve">Built a separate </w:t>
       </w:r>
-      <w:hyperlink r:id="rId40">
+      <w:hyperlink r:id="rId49">
         <w:r>
           <w:rPr>
             <w:color w:val="154D66"/>
@@ -1250,7 +1560,7 @@
       <w:pPr>
         <w:pStyle w:val="Entry"/>
       </w:pPr>
-      <w:hyperlink r:id="rId41">
+      <w:hyperlink r:id="rId50">
         <w:r>
           <w:rPr>
             <w:color w:val="000000"/>
@@ -1263,7 +1573,7 @@
         <w:rPr/>
         <w:t xml:space="preserve"> | </w:t>
       </w:r>
-      <w:hyperlink r:id="rId42">
+      <w:hyperlink r:id="rId51">
         <w:r>
           <w:rPr>
             <w:color w:val="000000"/>
@@ -1304,7 +1614,7 @@
       <w:pPr>
         <w:pStyle w:val="Entry"/>
       </w:pPr>
-      <w:hyperlink r:id="rId30">
+      <w:hyperlink r:id="rId39">
         <w:r>
           <w:rPr>
             <w:color w:val="000000"/>
@@ -1368,7 +1678,7 @@
       </w:r>
       <w:r>
         <w:rPr/>
-        <w:t xml:space="preserve"> R (tidyverse and pharmaverse), SAS (Base, Macro, STAT, SQL), Python, SQL, JavaScript, LaTeX, Git, Docker, high-performance computing, public API integration and browser testing.</w:t>
+        <w:t xml:space="preserve"> R (tidyverse, pharmaverse and Shiny), Quarto, SAS (Base, Macro, STAT, SQL), Python, SQL, JavaScript, LaTeX, Git, Docker, high-performance computing, public API integration and browser testing.</w:t>
       </w:r>
     </w:p>
     <w:p>
@@ -1394,38 +1704,11 @@
     <w:p>
       <w:pPr>
         <w:pStyle w:val="Heading1"/>
-        <w:pageBreakBefore/>
-      </w:pPr>
-      <w:r>
-        <w:rPr/>
-        <w:t>Clinical biometrics software</w:t>
-      </w:r>
-    </w:p>
-    <w:p>
-      <w:pPr>
-        <w:pStyle w:val="Entry"/>
-      </w:pPr>
-      <w:hyperlink r:id="rId43">
-        <w:r>
-          <w:rPr>
-            <w:color w:val="000000"/>
-            <w:b/>
-          </w:rPr>
-          <w:t>Clinical biostatistics and AI portfolio</w:t>
-        </w:r>
-      </w:hyperlink>
-      <w:r>
-        <w:rPr/>
-        <w:t xml:space="preserve"> | </w:t>
-      </w:r>
-      <w:hyperlink r:id="rId44">
-        <w:r>
-          <w:rPr>
-            <w:color w:val="000000"/>
-          </w:rPr>
-          <w:t>Source</w:t>
-        </w:r>
-      </w:hyperlink>
+      </w:pPr>
+      <w:r>
+        <w:rPr/>
+        <w:t>AI evaluation tools</w:t>
+      </w:r>
     </w:p>
     <w:p>
       <w:pPr>
@@ -1436,154 +1719,7 @@
         </w:numPr>
         <w:ind w:left="202" w:hanging="202"/>
       </w:pPr>
-      <w:r>
-        <w:rPr/>
-        <w:t>Developed 217 ADaM-based TLF pseudocode templates per language in SAS and R for parallel, crossover, fixed-sequence, SAD and MAD designs, with executable examples identified separately.</w:t>
-      </w:r>
-    </w:p>
-    <w:p>
-      <w:pPr>
-        <w:pStyle w:val="Bullet"/>
-        <w:numPr>
-          <w:ilvl w:val="0"/>
-          <w:numId w:val="1027"/>
-        </w:numPr>
-        <w:ind w:left="202" w:hanging="202"/>
-      </w:pPr>
-      <w:r>
-        <w:rPr/>
-        <w:t>Built an eight-domain synthetic ADaM sandbox with one-compartment oral PK/NCA and a 2-by-2 bioequivalence crossover ANOVA.</w:t>
-      </w:r>
-    </w:p>
-    <w:p>
-      <w:pPr>
-        <w:pStyle w:val="Bullet"/>
-        <w:numPr>
-          <w:ilvl w:val="0"/>
-          <w:numId w:val="1027"/>
-        </w:numPr>
-        <w:ind w:left="202" w:hanging="202"/>
-      </w:pPr>
-      <w:r>
-        <w:rPr/>
-        <w:t>Developed protocol-to-CSR templates, numeric-provenance checks for TLF interpretation and a seven-gate QC workflow covering reproducibility, CDISC, SAS/R parity, adversarial QC, reporting and AI-use documentation.</w:t>
-      </w:r>
-    </w:p>
-    <w:p>
-      <w:pPr>
-        <w:pStyle w:val="Bullet"/>
-        <w:numPr>
-          <w:ilvl w:val="0"/>
-          <w:numId w:val="1027"/>
-        </w:numPr>
-        <w:ind w:left="202" w:hanging="202"/>
-      </w:pPr>
-      <w:r>
-        <w:rPr/>
-        <w:t>Created participant-monitoring and trial-risk prototypes, SAS/R monitoring, continuity materials and an IRT/RTSM user-acceptance workbook with traceability and release criteria.</w:t>
-      </w:r>
-    </w:p>
-    <w:p>
-      <w:pPr>
-        <w:pStyle w:val="Bullet"/>
-        <w:numPr>
-          <w:ilvl w:val="0"/>
-          <w:numId w:val="1027"/>
-        </w:numPr>
-        <w:ind w:left="202" w:hanging="202"/>
-      </w:pPr>
-      <w:r>
-        <w:rPr/>
-        <w:t>Documented hybrid cloud/on-premises and on-device model patterns, with AI training for biometrics.</w:t>
-      </w:r>
-    </w:p>
-    <w:p>
-      <w:pPr>
-        <w:pStyle w:val="Entry"/>
-      </w:pPr>
-      <w:hyperlink r:id="rId45">
-        <w:r>
-          <w:rPr>
-            <w:color w:val="000000"/>
-            <w:b/>
-          </w:rPr>
-          <w:t>eCRF pipeline applications</w:t>
-        </w:r>
-      </w:hyperlink>
-      <w:r>
-        <w:rPr/>
-        <w:t xml:space="preserve"> | </w:t>
-      </w:r>
-      <w:hyperlink r:id="rId46">
-        <w:r>
-          <w:rPr>
-            <w:color w:val="000000"/>
-          </w:rPr>
-          <w:t>Demo overview</w:t>
-        </w:r>
-      </w:hyperlink>
-    </w:p>
-    <w:p>
-      <w:pPr>
-        <w:pStyle w:val="Bullet"/>
-        <w:numPr>
-          <w:ilvl w:val="0"/>
-          <w:numId w:val="1027"/>
-        </w:numPr>
-        <w:ind w:left="202" w:hanging="202"/>
-      </w:pPr>
-      <w:r>
-        <w:rPr/>
-        <w:t>Built four Streamlit prototypes for adverse-event coding, PII/PHI flagging/redaction, rule-based participant-risk review and longitudinal anomaly/drift detection.</w:t>
-      </w:r>
-    </w:p>
-    <w:p>
-      <w:pPr>
-        <w:pStyle w:val="Bullet"/>
-        <w:numPr>
-          <w:ilvl w:val="0"/>
-          <w:numId w:val="1027"/>
-        </w:numPr>
-        <w:ind w:left="202" w:hanging="202"/>
-      </w:pPr>
-      <w:r>
-        <w:rPr/>
-        <w:t>Separated deterministic stand-ins from optional model, Sinkhorn and Isolation Forest paths; public demonstrations and evaluations use synthetic data.</w:t>
-      </w:r>
-    </w:p>
-    <w:p>
-      <w:pPr>
-        <w:pStyle w:val="Bullet"/>
-        <w:numPr>
-          <w:ilvl w:val="0"/>
-          <w:numId w:val="1027"/>
-        </w:numPr>
-        <w:ind w:left="202" w:hanging="202"/>
-      </w:pPr>
-      <w:r>
-        <w:rPr/>
-        <w:t>Logged input hashes, configuration, paths and thresholds for traceable reruns with retained inputs and software/model artifacts; provided runnable QC.</w:t>
-      </w:r>
-    </w:p>
-    <w:p>
-      <w:pPr>
-        <w:pStyle w:val="Heading1"/>
-      </w:pPr>
-      <w:r>
-        <w:rPr/>
-        <w:t>AI evaluation tools</w:t>
-      </w:r>
-    </w:p>
-    <w:p>
-      <w:pPr>
-        <w:pStyle w:val="Bullet"/>
-        <w:numPr>
-          <w:ilvl w:val="0"/>
-          <w:numId w:val="1027"/>
-        </w:numPr>
-        <w:ind w:left="202" w:hanging="202"/>
-      </w:pPr>
-      <w:hyperlink r:id="rId47">
+      <w:hyperlink r:id="rId52">
         <w:r>
           <w:rPr>
             <w:color w:val="154D66"/>
@@ -1612,7 +1748,7 @@
         </w:numPr>
         <w:ind w:left="202" w:hanging="202"/>
       </w:pPr>
-      <w:hyperlink r:id="rId48">
+      <w:hyperlink r:id="rId53">
         <w:r>
           <w:rPr>
             <w:color w:val="154D66"/>
@@ -1641,7 +1777,7 @@
         </w:numPr>
         <w:ind w:left="202" w:hanging="202"/>
       </w:pPr>
-      <w:hyperlink r:id="rId49">
+      <w:hyperlink r:id="rId54">
         <w:r>
           <w:rPr>
             <w:color w:val="154D66"/>
@@ -1670,7 +1806,7 @@
         </w:numPr>
         <w:ind w:left="202" w:hanging="202"/>
       </w:pPr>
-      <w:hyperlink r:id="rId50">
+      <w:hyperlink r:id="rId55">
         <w:r>
           <w:rPr>
             <w:color w:val="154D66"/>
@@ -1699,7 +1835,7 @@
         </w:numPr>
         <w:ind w:left="202" w:hanging="202"/>
       </w:pPr>
-      <w:hyperlink r:id="rId51">
+      <w:hyperlink r:id="rId56">
         <w:r>
           <w:rPr>
             <w:color w:val="154D66"/>
@@ -1757,7 +1893,7 @@
         <w:rPr/>
         <w:t xml:space="preserve">. 2024;119(1):160-168. </w:t>
       </w:r>
-      <w:hyperlink r:id="rId52">
+      <w:hyperlink r:id="rId57">
         <w:r>
           <w:rPr>
             <w:color w:val="154D66"/>
@@ -6034,7 +6170,6 @@
           <w:bar w:val="nil"/>
         </w:pBdr>
         <w:shd w:color="auto" w:fill="auto" w:val="clear"/>
-        <w:suppressAutoHyphens w:val="0"/>
         <w:spacing w:after="0" w:afterAutospacing="0" w:before="0" w:beforeAutospacing="0" w:line="240" w:lineRule="auto"/>
         <w:ind w:firstLine="0" w:left="0" w:right="0"/>
         <w:jc w:val="left"/>
@@ -6110,7 +6245,6 @@
       <w:tabs>
         <w:tab w:pos="9020" w:val="right"/>
       </w:tabs>
-      <w:suppressAutoHyphens w:val="0"/>
       <w:bidi w:val="0"/>
       <w:spacing w:after="0" w:before="0" w:line="240" w:lineRule="auto"/>
       <w:ind w:firstLine="0" w:left="0" w:right="0"/>
@@ -6203,7 +6337,6 @@
       <w:pageBreakBefore w:val="0"/>
       <w:widowControl w:val="1"/>
       <w:shd w:color="auto" w:fill="auto" w:val="clear"/>
-      <w:suppressAutoHyphens w:val="0"/>
       <w:bidi w:val="0"/>
       <w:spacing w:after="0" w:before="160" w:line="288" w:lineRule="auto"/>
       <w:ind w:firstLine="0" w:left="0" w:right="0"/>

</xml_diff>

<commit_message>
README, resume and CV: the trial biostatistics toolkit, current test counts and statuses
- The clinical work is described as a toolkit for lead biostatisticians (worked
  examples, templates, apps and checks), linked at its site home.
- TRIALMON: 654 expectations in 69 tests pass (was 215 in 42).
- The three in-browser R apps report each loading stage and any failure, and a
  deploy test opens every app before publishing; checked in Chrome only.
- Research statuses dated 26 October 2026; resume 2 pages and CV 5 pages,
  rebuilt and verified (text, links and style).

Co-Authored-By: Claude Opus 5.5 <noreply@anthropic.com>
</commit_message>
<xml_diff>
--- a/careers/Patrick_Iben_CV.docx
+++ b/careers/Patrick_Iben_CV.docx
@@ -38,7 +38,7 @@
           <w:rPr>
             <w:color w:val="154D66"/>
           </w:rPr>
-          <w:t>GitHub portfolio</w:t>
+          <w:t>GitHub</w:t>
         </w:r>
       </w:hyperlink>
       <w:r>
@@ -434,24 +434,27 @@
       </w:pPr>
       <w:r>
         <w:rPr/>
-        <w:t>Clinical biometrics portfolio (synthetic data)</w:t>
+        <w:t>Clinical trial toolkit</w:t>
       </w:r>
     </w:p>
     <w:p>
       <w:pPr>
         <w:pStyle w:val="Entry"/>
       </w:pPr>
-      <w:r>
-        <w:rPr>
-          <w:b/>
-        </w:rPr>
-        <w:t>Clinical trial biostatistics portfolio</w:t>
-      </w:r>
+      <w:hyperlink r:id="rId2">
+        <w:r>
+          <w:rPr>
+            <w:color w:val="000000"/>
+            <w:b/>
+          </w:rPr>
+          <w:t>Trial biostatistics toolkit</w:t>
+        </w:r>
+      </w:hyperlink>
       <w:r>
         <w:rPr/>
         <w:t xml:space="preserve"> | </w:t>
       </w:r>
-      <w:hyperlink r:id="rId2">
+      <w:hyperlink r:id="rId3">
         <w:r>
           <w:rPr>
             <w:color w:val="000000"/>
@@ -459,6 +462,10 @@
           <w:t>Source</w:t>
         </w:r>
       </w:hyperlink>
+      <w:r>
+        <w:rPr/>
+        <w:t xml:space="preserve"> | Worked examples, templates, apps and checks for lead biostatisticians, organized by task across the trial lifecycle (example data synthetic)</w:t>
+      </w:r>
     </w:p>
     <w:p>
       <w:pPr>
@@ -473,7 +480,7 @@
         <w:rPr/>
         <w:t xml:space="preserve">Built an end-to-end </w:t>
       </w:r>
-      <w:hyperlink r:id="rId3">
+      <w:hyperlink r:id="rId16">
         <w:r>
           <w:rPr>
             <w:color w:val="154D66"/>
@@ -499,7 +506,7 @@
         <w:rPr/>
         <w:t xml:space="preserve">Implemented </w:t>
       </w:r>
-      <w:hyperlink r:id="rId16">
+      <w:hyperlink r:id="rId17">
         <w:r>
           <w:rPr>
             <w:color w:val="154D66"/>
@@ -509,7 +516,7 @@
       </w:hyperlink>
       <w:r>
         <w:rPr/>
-        <w:t xml:space="preserve"> for a synthetic first-in-human dose-escalation study: potential Hy's Law per the 2009 FDA DILI guidance, with a 30-day window as an SAP convention; confirmation flags for ALT or AST above 3x ULN; ICH E14 QTcF categories; and a worst-of roll-up. Built a Safety Review Committee packet, a Shiny console and a 12-cell Hy's Law convention-sensitivity grid; 215 expectations in 42 tests pass. Not validated, not reviewed by a medical monitor, and author sign-off pending.</w:t>
+        <w:t xml:space="preserve"> for a synthetic first-in-human dose-escalation study: potential Hy's Law per the 2009 FDA DILI guidance, with a 30-day window as an SAP convention; confirmation flags for ALT or AST above 3x ULN; ICH E14 QTcF categories; and a worst-of roll-up. Built a Safety Review Committee packet, a Shiny console and a 12-cell Hy's Law convention-sensitivity grid; 654 expectations in 69 tests pass. Not validated, not reviewed by a medical monitor, and author sign-off pending.</w:t>
       </w:r>
     </w:p>
     <w:p>
@@ -553,7 +560,7 @@
         <w:rPr/>
         <w:t xml:space="preserve">Built a </w:t>
       </w:r>
-      <w:hyperlink r:id="rId17">
+      <w:hyperlink r:id="rId18">
         <w:r>
           <w:rPr>
             <w:color w:val="154D66"/>
@@ -563,7 +570,7 @@
       </w:hyperlink>
       <w:r>
         <w:rPr/>
-        <w:t xml:space="preserve"> for the portfolio. A same-author recomputation of the PK sandbox's 80 profiles by a second route agreed within a maximum relative difference of 4.4e-10. Applied established error seeding, adapted from the teeth check in the Consilience Engine software: of 18 pre-registered seeded defects, 14 were caught, 1 survived, 1 was equivalent and 2 were not applicable (counts for this list, not a detection rate). Only the recomputation gate caught the seven numeric and counting defects. Human sign-off is pending on every gate.</w:t>
+        <w:t xml:space="preserve"> for the toolkit. A same-author recomputation of the PK sandbox's 80 profiles by a second route agreed within a maximum relative difference of 4.4e-10. Applied established error seeding, adapted from the teeth check in the Consilience Engine software: of 18 pre-registered seeded defects, 14 were caught, 1 survived, 1 was equivalent and 2 were not applicable (counts for this list, not a detection rate). Only the recomputation gate caught the seven numeric and counting defects. Human sign-off is pending on every gate.</w:t>
       </w:r>
     </w:p>
     <w:p>
@@ -593,7 +600,7 @@
         <w:rPr/>
         <w:t xml:space="preserve">Ran an exploratory, ADEMP-reported </w:t>
       </w:r>
-      <w:hyperlink r:id="rId18">
+      <w:hyperlink r:id="rId19">
         <w:r>
           <w:rPr>
             <w:color w:val="154D66"/>
@@ -619,7 +626,7 @@
         <w:rPr/>
         <w:t xml:space="preserve">Formalized the standard C-QTc hysteresis check as an exploratory, prespecified test on the established </w:t>
       </w:r>
-      <w:hyperlink r:id="rId19">
+      <w:hyperlink r:id="rId20">
         <w:r>
           <w:rPr>
             <w:color w:val="154D66"/>
@@ -643,14 +650,14 @@
       </w:pPr>
       <w:r>
         <w:rPr/>
-        <w:t>Made three R Shiny apps (safety review, IRT/RTSM acceptance tracking and study lifecycle monitoring) run in the browser with Shinylive on bundled synthetic data, checked in Chrome only. Built an IRT/RTSM user-acceptance test library with traceability and release criteria and a coverage and continuity toolkit that runs in the browser; the SAS/R monitoring macros are not executed.</w:t>
+        <w:t>Made three R Shiny apps (safety review, IRT/RTSM acceptance tracking and study lifecycle monitoring) run in the browser with Shinylive, with a launch page that reports each loading stage and any failure, and a deploy test that opens every app in headless Chrome and blocks publishing unless all outputs fill; checked in Chrome only. Built an IRT/RTSM user-acceptance test library with traceability and release criteria and a coverage and continuity toolkit that runs in the browser; the SAS/R monitoring macros are not executed.</w:t>
       </w:r>
     </w:p>
     <w:p>
       <w:pPr>
         <w:pStyle w:val="Entry"/>
       </w:pPr>
-      <w:hyperlink r:id="rId20">
+      <w:hyperlink r:id="rId21">
         <w:r>
           <w:rPr>
             <w:color w:val="000000"/>
@@ -663,7 +670,7 @@
         <w:rPr/>
         <w:t xml:space="preserve"> | </w:t>
       </w:r>
-      <w:hyperlink r:id="rId21">
+      <w:hyperlink r:id="rId22">
         <w:r>
           <w:rPr>
             <w:color w:val="000000"/>
@@ -675,7 +682,7 @@
         <w:rPr/>
         <w:t xml:space="preserve"> | </w:t>
       </w:r>
-      <w:hyperlink r:id="rId22">
+      <w:hyperlink r:id="rId23">
         <w:r>
           <w:rPr>
             <w:color w:val="000000"/>
@@ -753,7 +760,7 @@
       <w:pPr/>
       <w:r>
         <w:rPr/>
-        <w:t xml:space="preserve">Submission and review statuses as of 23 October 2026. Public drafts, study artifacts, software and teaching materials are mapped in the </w:t>
+        <w:t xml:space="preserve">Submission and review statuses as of 26 October 2026. Public drafts, study artifacts, software and teaching materials are mapped in the </w:t>
       </w:r>
       <w:hyperlink r:id="rId1">
         <w:r>
@@ -813,7 +820,7 @@
         <w:pStyle w:val="LinkLine"/>
         <w:ind w:left="202"/>
       </w:pPr>
-      <w:hyperlink r:id="rId23">
+      <w:hyperlink r:id="rId24">
         <w:r>
           <w:rPr>
             <w:color w:val="154D66"/>
@@ -825,7 +832,7 @@
         <w:rPr/>
         <w:t xml:space="preserve"> | </w:t>
       </w:r>
-      <w:hyperlink r:id="rId24">
+      <w:hyperlink r:id="rId25">
         <w:r>
           <w:rPr>
             <w:color w:val="154D66"/>
@@ -837,7 +844,7 @@
         <w:rPr/>
         <w:t xml:space="preserve"> | </w:t>
       </w:r>
-      <w:hyperlink r:id="rId25">
+      <w:hyperlink r:id="rId26">
         <w:r>
           <w:rPr>
             <w:color w:val="154D66"/>
@@ -849,7 +856,7 @@
         <w:rPr/>
         <w:t xml:space="preserve"> | </w:t>
       </w:r>
-      <w:hyperlink r:id="rId26">
+      <w:hyperlink r:id="rId27">
         <w:r>
           <w:rPr>
             <w:color w:val="154D66"/>
@@ -903,7 +910,7 @@
         <w:pStyle w:val="LinkLine"/>
         <w:ind w:left="202"/>
       </w:pPr>
-      <w:hyperlink r:id="rId27">
+      <w:hyperlink r:id="rId28">
         <w:r>
           <w:rPr>
             <w:color w:val="154D66"/>
@@ -915,7 +922,7 @@
         <w:rPr/>
         <w:t xml:space="preserve"> | </w:t>
       </w:r>
-      <w:hyperlink r:id="rId28">
+      <w:hyperlink r:id="rId29">
         <w:r>
           <w:rPr>
             <w:color w:val="154D66"/>
@@ -927,7 +934,7 @@
         <w:rPr/>
         <w:t xml:space="preserve"> | </w:t>
       </w:r>
-      <w:hyperlink r:id="rId29">
+      <w:hyperlink r:id="rId30">
         <w:r>
           <w:rPr>
             <w:color w:val="154D66"/>
@@ -939,7 +946,7 @@
         <w:rPr/>
         <w:t xml:space="preserve"> | </w:t>
       </w:r>
-      <w:hyperlink r:id="rId30">
+      <w:hyperlink r:id="rId31">
         <w:r>
           <w:rPr>
             <w:color w:val="154D66"/>
@@ -983,7 +990,7 @@
         <w:pStyle w:val="LinkLine"/>
         <w:ind w:left="202"/>
       </w:pPr>
-      <w:hyperlink r:id="rId31">
+      <w:hyperlink r:id="rId32">
         <w:r>
           <w:rPr>
             <w:color w:val="154D66"/>
@@ -995,7 +1002,7 @@
         <w:rPr/>
         <w:t xml:space="preserve"> | </w:t>
       </w:r>
-      <w:hyperlink r:id="rId32">
+      <w:hyperlink r:id="rId33">
         <w:r>
           <w:rPr>
             <w:color w:val="154D66"/>
@@ -1007,7 +1014,7 @@
         <w:rPr/>
         <w:t xml:space="preserve"> | </w:t>
       </w:r>
-      <w:hyperlink r:id="rId33">
+      <w:hyperlink r:id="rId34">
         <w:r>
           <w:rPr>
             <w:color w:val="154D66"/>
@@ -1061,7 +1068,7 @@
         <w:pStyle w:val="LinkLine"/>
         <w:ind w:left="202"/>
       </w:pPr>
-      <w:hyperlink r:id="rId34">
+      <w:hyperlink r:id="rId35">
         <w:r>
           <w:rPr>
             <w:color w:val="154D66"/>
@@ -1073,7 +1080,7 @@
         <w:rPr/>
         <w:t xml:space="preserve"> | </w:t>
       </w:r>
-      <w:hyperlink r:id="rId35">
+      <w:hyperlink r:id="rId36">
         <w:r>
           <w:rPr>
             <w:color w:val="154D66"/>
@@ -1085,7 +1092,7 @@
         <w:rPr/>
         <w:t xml:space="preserve"> | </w:t>
       </w:r>
-      <w:hyperlink r:id="rId36">
+      <w:hyperlink r:id="rId37">
         <w:r>
           <w:rPr>
             <w:color w:val="154D66"/>
@@ -1097,7 +1104,7 @@
         <w:rPr/>
         <w:t xml:space="preserve"> | </w:t>
       </w:r>
-      <w:hyperlink r:id="rId37">
+      <w:hyperlink r:id="rId38">
         <w:r>
           <w:rPr>
             <w:color w:val="154D66"/>
@@ -1151,7 +1158,7 @@
         <w:pStyle w:val="LinkLine"/>
         <w:ind w:left="202"/>
       </w:pPr>
-      <w:hyperlink r:id="rId38">
+      <w:hyperlink r:id="rId39">
         <w:r>
           <w:rPr>
             <w:color w:val="154D66"/>
@@ -1163,7 +1170,7 @@
         <w:rPr/>
         <w:t xml:space="preserve"> | </w:t>
       </w:r>
-      <w:hyperlink r:id="rId39">
+      <w:hyperlink r:id="rId40">
         <w:r>
           <w:rPr>
             <w:color w:val="154D66"/>
@@ -1175,7 +1182,7 @@
         <w:rPr/>
         <w:t xml:space="preserve"> | </w:t>
       </w:r>
-      <w:hyperlink r:id="rId40">
+      <w:hyperlink r:id="rId41">
         <w:r>
           <w:rPr>
             <w:color w:val="154D66"/>
@@ -1219,7 +1226,7 @@
         <w:pStyle w:val="LinkLine"/>
         <w:ind w:left="202"/>
       </w:pPr>
-      <w:hyperlink r:id="rId41">
+      <w:hyperlink r:id="rId42">
         <w:r>
           <w:rPr>
             <w:color w:val="154D66"/>
@@ -1231,7 +1238,7 @@
         <w:rPr/>
         <w:t xml:space="preserve"> | </w:t>
       </w:r>
-      <w:hyperlink r:id="rId42">
+      <w:hyperlink r:id="rId43">
         <w:r>
           <w:rPr>
             <w:color w:val="154D66"/>
@@ -1243,7 +1250,7 @@
         <w:rPr/>
         <w:t xml:space="preserve"> | </w:t>
       </w:r>
-      <w:hyperlink r:id="rId43">
+      <w:hyperlink r:id="rId44">
         <w:r>
           <w:rPr>
             <w:color w:val="154D66"/>
@@ -1328,7 +1335,7 @@
       <w:pPr>
         <w:pStyle w:val="Entry"/>
       </w:pPr>
-      <w:hyperlink r:id="rId44">
+      <w:hyperlink r:id="rId45">
         <w:r>
           <w:rPr>
             <w:color w:val="000000"/>
@@ -1341,7 +1348,7 @@
         <w:rPr/>
         <w:t xml:space="preserve"> | </w:t>
       </w:r>
-      <w:hyperlink r:id="rId45">
+      <w:hyperlink r:id="rId46">
         <w:r>
           <w:rPr>
             <w:color w:val="000000"/>
@@ -1410,7 +1417,7 @@
       <w:pPr>
         <w:pStyle w:val="Entry"/>
       </w:pPr>
-      <w:hyperlink r:id="rId46">
+      <w:hyperlink r:id="rId47">
         <w:r>
           <w:rPr>
             <w:color w:val="000000"/>
@@ -1480,7 +1487,7 @@
       <w:pPr>
         <w:pStyle w:val="Entry"/>
       </w:pPr>
-      <w:hyperlink r:id="rId47">
+      <w:hyperlink r:id="rId48">
         <w:r>
           <w:rPr>
             <w:color w:val="000000"/>
@@ -1493,7 +1500,7 @@
         <w:rPr/>
         <w:t xml:space="preserve"> | </w:t>
       </w:r>
-      <w:hyperlink r:id="rId48">
+      <w:hyperlink r:id="rId49">
         <w:r>
           <w:rPr>
             <w:color w:val="000000"/>
@@ -1543,7 +1550,7 @@
         <w:rPr/>
         <w:t xml:space="preserve">Built a separate </w:t>
       </w:r>
-      <w:hyperlink r:id="rId49">
+      <w:hyperlink r:id="rId50">
         <w:r>
           <w:rPr>
             <w:color w:val="154D66"/>
@@ -1560,7 +1567,7 @@
       <w:pPr>
         <w:pStyle w:val="Entry"/>
       </w:pPr>
-      <w:hyperlink r:id="rId50">
+      <w:hyperlink r:id="rId51">
         <w:r>
           <w:rPr>
             <w:color w:val="000000"/>
@@ -1573,7 +1580,7 @@
         <w:rPr/>
         <w:t xml:space="preserve"> | </w:t>
       </w:r>
-      <w:hyperlink r:id="rId51">
+      <w:hyperlink r:id="rId52">
         <w:r>
           <w:rPr>
             <w:color w:val="000000"/>
@@ -1614,7 +1621,7 @@
       <w:pPr>
         <w:pStyle w:val="Entry"/>
       </w:pPr>
-      <w:hyperlink r:id="rId39">
+      <w:hyperlink r:id="rId40">
         <w:r>
           <w:rPr>
             <w:color w:val="000000"/>
@@ -1719,7 +1726,7 @@
         </w:numPr>
         <w:ind w:left="202" w:hanging="202"/>
       </w:pPr>
-      <w:hyperlink r:id="rId52">
+      <w:hyperlink r:id="rId53">
         <w:r>
           <w:rPr>
             <w:color w:val="154D66"/>
@@ -1748,7 +1755,7 @@
         </w:numPr>
         <w:ind w:left="202" w:hanging="202"/>
       </w:pPr>
-      <w:hyperlink r:id="rId53">
+      <w:hyperlink r:id="rId54">
         <w:r>
           <w:rPr>
             <w:color w:val="154D66"/>
@@ -1777,7 +1784,7 @@
         </w:numPr>
         <w:ind w:left="202" w:hanging="202"/>
       </w:pPr>
-      <w:hyperlink r:id="rId54">
+      <w:hyperlink r:id="rId55">
         <w:r>
           <w:rPr>
             <w:color w:val="154D66"/>
@@ -1806,7 +1813,7 @@
         </w:numPr>
         <w:ind w:left="202" w:hanging="202"/>
       </w:pPr>
-      <w:hyperlink r:id="rId55">
+      <w:hyperlink r:id="rId56">
         <w:r>
           <w:rPr>
             <w:color w:val="154D66"/>
@@ -1835,7 +1842,7 @@
         </w:numPr>
         <w:ind w:left="202" w:hanging="202"/>
       </w:pPr>
-      <w:hyperlink r:id="rId56">
+      <w:hyperlink r:id="rId57">
         <w:r>
           <w:rPr>
             <w:color w:val="154D66"/>
@@ -1893,7 +1900,7 @@
         <w:rPr/>
         <w:t xml:space="preserve">. 2024;119(1):160-168. </w:t>
       </w:r>
-      <w:hyperlink r:id="rId57">
+      <w:hyperlink r:id="rId58">
         <w:r>
           <w:rPr>
             <w:color w:val="154D66"/>

</xml_diff>

<commit_message>
Resume and CV: link-free versions, plain-language project and manuscript descriptions
Co-Authored-By: Claude Opus 5.5 <noreply@anthropic.com>
</commit_message>
<xml_diff>
--- a/careers/Patrick_Iben_CV.docx
+++ b/careers/Patrick_Iben_CV.docx
@@ -33,38 +33,10 @@
       <w:pPr>
         <w:pStyle w:val="Contact"/>
       </w:pPr>
-      <w:hyperlink r:id="rId15">
-        <w:r>
-          <w:rPr>
-            <w:color w:val="154D66"/>
-          </w:rPr>
-          <w:t>GitHub</w:t>
-        </w:r>
-      </w:hyperlink>
-      <w:r>
-        <w:rPr/>
-        <w:t xml:space="preserve"> | </w:t>
-      </w:r>
-      <w:hyperlink r:id="rId1">
-        <w:r>
-          <w:rPr>
-            <w:color w:val="154D66"/>
-          </w:rPr>
-          <w:t>Manuscripts and teaching materials</w:t>
-        </w:r>
-      </w:hyperlink>
-      <w:r>
-        <w:rPr/>
-        <w:t xml:space="preserve"> | </w:t>
-      </w:r>
-      <w:hyperlink r:id="rId14">
-        <w:r>
-          <w:rPr>
-            <w:color w:val="154D66"/>
-          </w:rPr>
-          <w:t>ORCID 0009-0005-2443-7973</w:t>
-        </w:r>
-      </w:hyperlink>
+      <w:r>
+        <w:rPr/>
+        <w:t>GitHub: patrickiben | ORCID: 0009-0005-2443-7973</w:t>
+      </w:r>
     </w:p>
     <w:p>
       <w:pPr>
@@ -434,37 +406,39 @@
       </w:pPr>
       <w:r>
         <w:rPr/>
-        <w:t>Clinical trial toolkit</w:t>
+        <w:t>Publications and manuscripts</w:t>
+      </w:r>
+    </w:p>
+    <w:p>
+      <w:pPr/>
+      <w:r>
+        <w:rPr/>
+        <w:t>Submission and review statuses as of 26 October 2026.</w:t>
       </w:r>
     </w:p>
     <w:p>
       <w:pPr>
         <w:pStyle w:val="Entry"/>
       </w:pPr>
-      <w:hyperlink r:id="rId2">
-        <w:r>
-          <w:rPr>
-            <w:color w:val="000000"/>
-            <w:b/>
-          </w:rPr>
-          <w:t>Trial biostatistics toolkit</w:t>
-        </w:r>
-      </w:hyperlink>
-      <w:r>
-        <w:rPr/>
-        <w:t xml:space="preserve"> | </w:t>
-      </w:r>
-      <w:hyperlink r:id="rId3">
-        <w:r>
-          <w:rPr>
-            <w:color w:val="000000"/>
-          </w:rPr>
-          <w:t>Source</w:t>
-        </w:r>
-      </w:hyperlink>
-      <w:r>
-        <w:rPr/>
-        <w:t xml:space="preserve"> | Worked examples, templates, apps and checks for lead biostatisticians, organized by task across the trial lifecycle (example data synthetic)</w:t>
+      <w:r>
+        <w:rPr>
+          <w:b/>
+        </w:rPr>
+        <w:t>Contamination-resilient cluster randomized trial design under spatial interference: a simulation study of contamination control.</w:t>
+      </w:r>
+      <w:r>
+        <w:rPr/>
+        <w:t xml:space="preserve"> </w:t>
+      </w:r>
+      <w:r>
+        <w:rPr>
+          <w:i/>
+        </w:rPr>
+        <w:t>Statistics in Medicine</w:t>
+      </w:r>
+      <w:r>
+        <w:rPr/>
+        <w:t>, submitted.</w:t>
       </w:r>
     </w:p>
     <w:p>
@@ -478,19 +452,7 @@
       </w:pPr>
       <w:r>
         <w:rPr/>
-        <w:t xml:space="preserve">Built an end-to-end </w:t>
-      </w:r>
-      <w:hyperlink r:id="rId16">
-        <w:r>
-          <w:rPr>
-            <w:color w:val="154D66"/>
-          </w:rPr>
-          <w:t>worked bioequivalence study</w:t>
-        </w:r>
-      </w:hyperlink>
-      <w:r>
-        <w:rPr/>
-        <w:t xml:space="preserve"> on synthetic data (2x2 crossover, N = 40), from PowerTOST sample size and randomization through an ICH E9(R1) estimand and SAP, admiral ADaM, PKNCA noncompartmental analysis, the ICH M13A model, rtables/tern TLFs and CSR Section 11-style text. One script regenerates every output and CI reruns it. QC is an executed same-author re-derivation (79 NCA profiles, 0 mismatches), not independent double programming; define.xml, Pinnacle 21 and SAS are not covered.</w:t>
+        <w:t>Developed a design framework for cluster randomized trials in which treatment effects spill between nearby sites, and tested it by simulation on 57 real malaria survey sites in Uganda.</w:t>
       </w:r>
     </w:p>
     <w:p>
@@ -504,19 +466,32 @@
       </w:pPr>
       <w:r>
         <w:rPr/>
-        <w:t xml:space="preserve">Implemented </w:t>
-      </w:r>
-      <w:hyperlink r:id="rId17">
-        <w:r>
-          <w:rPr>
-            <w:color w:val="154D66"/>
-          </w:rPr>
-          <w:t>safety-review screening rules</w:t>
-        </w:r>
-      </w:hyperlink>
-      <w:r>
-        <w:rPr/>
-        <w:t xml:space="preserve"> for a synthetic first-in-human dose-escalation study: potential Hy's Law per the 2009 FDA DILI guidance, with a 30-day window as an SAP convention; confirmation flags for ALT or AST above 3x ULN; ICH E14 QTcF categories; and a worst-of roll-up. Built a Safety Review Committee packet, a Shiny console and a 12-cell Hy's Law convention-sensitivity grid; 654 expectations in 69 tests pass. Not validated, not reviewed by a medical monitor, and author sign-off pending.</w:t>
+        <w:t>Preprint doi:10.5281/zenodo.23486176.</w:t>
+      </w:r>
+    </w:p>
+    <w:p>
+      <w:pPr>
+        <w:pStyle w:val="Entry"/>
+      </w:pPr>
+      <w:r>
+        <w:rPr>
+          <w:b/>
+        </w:rPr>
+        <w:t>What do within-site comparisons of AlphaGenome Atlas predictions measure? An audit at ClinVar sites in 11 genes.</w:t>
+      </w:r>
+      <w:r>
+        <w:rPr/>
+        <w:t xml:space="preserve"> </w:t>
+      </w:r>
+      <w:r>
+        <w:rPr>
+          <w:i/>
+        </w:rPr>
+        <w:t>Human Genomics</w:t>
+      </w:r>
+      <w:r>
+        <w:rPr/>
+        <w:t>, submitted.</w:t>
       </w:r>
     </w:p>
     <w:p>
@@ -530,7 +505,7 @@
       </w:pPr>
       <w:r>
         <w:rPr/>
-        <w:t>Developed 221 ADaM-based TLF pseudocode programs per language in SAS and R for parallel, crossover, single-sequence, SAD and MAD designs. The SAS programs are not executed; the R programs are parse-checked, not run on data.</w:t>
+        <w:t>Audited what an AI genomics model's variant comparisons actually measure, separating benchmark accuracy from clinical meaning, with replication across genes.</w:t>
       </w:r>
     </w:p>
     <w:p>
@@ -544,7 +519,22 @@
       </w:pPr>
       <w:r>
         <w:rPr/>
-        <w:t>Built an eight-domain synthetic ADaM sandbox with one-compartment oral PK/NCA and a 2-by-2 bioequivalence crossover ANOVA that regenerates its committed outputs byte for byte.</w:t>
+        <w:t>Preprint doi:10.5281/zenodo.23543154.</w:t>
+      </w:r>
+    </w:p>
+    <w:p>
+      <w:pPr>
+        <w:pStyle w:val="Entry"/>
+      </w:pPr>
+      <w:r>
+        <w:rPr>
+          <w:b/>
+        </w:rPr>
+        <w:t>A false floor: Refuting our own information-limit claim in a lethal identification task.</w:t>
+      </w:r>
+      <w:r>
+        <w:rPr/>
+        <w:t xml:space="preserve"> Submitted to PLOS ONE, 22 October 2026.</w:t>
       </w:r>
     </w:p>
     <w:p>
@@ -558,19 +548,7 @@
       </w:pPr>
       <w:r>
         <w:rPr/>
-        <w:t xml:space="preserve">Built a </w:t>
-      </w:r>
-      <w:hyperlink r:id="rId18">
-        <w:r>
-          <w:rPr>
-            <w:color w:val="154D66"/>
-          </w:rPr>
-          <w:t>ten-gate QC harness</w:t>
-        </w:r>
-      </w:hyperlink>
-      <w:r>
-        <w:rPr/>
-        <w:t xml:space="preserve"> for the toolkit. A same-author recomputation of the PK sandbox's 80 profiles by a second route agreed within a maximum relative difference of 4.4e-10. Applied established error seeding, adapted from the teeth check in the Consilience Engine software: of 18 pre-registered seeded defects, 15 were caught, none survived, 1 was equivalent and 2 were not applicable (counts for this list, not a detection rate). Only the recomputation gate caught the seven numeric and counting defects. Human sign-off is pending on every gate.</w:t>
+        <w:t>Overturned our own earlier claim of a hard information limit in a high-stakes identification task, using stronger baselines and checks for overlap with the models' training data.</w:t>
       </w:r>
     </w:p>
     <w:p>
@@ -584,7 +562,32 @@
       </w:pPr>
       <w:r>
         <w:rPr/>
-        <w:t>Developed numeric-provenance checks for TLF interpretation (the language-model step is a stub) and custom structural dataset checks (not Pinnacle 21 or CDISC CORE).</w:t>
+        <w:t>Preprint doi:10.5281/zenodo.23519299.</w:t>
+      </w:r>
+    </w:p>
+    <w:p>
+      <w:pPr>
+        <w:pStyle w:val="Entry"/>
+      </w:pPr>
+      <w:r>
+        <w:rPr>
+          <w:b/>
+        </w:rPr>
+        <w:t>Anticipating network contagions: when directedness outperforms connectedness.</w:t>
+      </w:r>
+      <w:r>
+        <w:rPr/>
+        <w:t xml:space="preserve"> </w:t>
+      </w:r>
+      <w:r>
+        <w:rPr>
+          <w:i/>
+        </w:rPr>
+        <w:t>Applied Network Science</w:t>
+      </w:r>
+      <w:r>
+        <w:rPr/>
+        <w:t>, with editor.</w:t>
       </w:r>
     </w:p>
     <w:p>
@@ -598,19 +601,32 @@
       </w:pPr>
       <w:r>
         <w:rPr/>
-        <w:t xml:space="preserve">Ran an exploratory, ADEMP-reported </w:t>
-      </w:r>
-      <w:hyperlink r:id="rId19">
-        <w:r>
-          <w:rPr>
-            <w:color w:val="154D66"/>
-          </w:rPr>
-          <w:t>residual-carryover simulation</w:t>
-        </w:r>
-      </w:hyperlink>
-      <w:r>
-        <w:rPr/>
-        <w:t xml:space="preserve"> of the ICH M13A 5% pre-dose rule in a synthetic 2x2 design (n = 24). With a two-half-life washout, naive consumer risk at a true GMR of 1.25 was 0.318 versus 0.051 without residual drug; at five half-lives the rule excluded 34% of participants, unevenly by sequence. The design follows the cluster randomized trial simulation study.</w:t>
+        <w:t>Showed that targeting the units that transmit a contagion can beat targeting the hardest-hit ones, using a measure of directional asymmetry across seven contagion datasets (interventions simulated).</w:t>
+      </w:r>
+    </w:p>
+    <w:p>
+      <w:pPr>
+        <w:pStyle w:val="Entry"/>
+      </w:pPr>
+      <w:r>
+        <w:rPr>
+          <w:b/>
+        </w:rPr>
+        <w:t>Which data modality recognizes a gene set? A domain-agnostic consilience engine.</w:t>
+      </w:r>
+      <w:r>
+        <w:rPr/>
+        <w:t xml:space="preserve"> </w:t>
+      </w:r>
+      <w:r>
+        <w:rPr>
+          <w:i/>
+        </w:rPr>
+        <w:t>PeerJ</w:t>
+      </w:r>
+      <w:r>
+        <w:rPr/>
+        <w:t>, in peer review.</w:t>
       </w:r>
     </w:p>
     <w:p>
@@ -624,19 +640,22 @@
       </w:pPr>
       <w:r>
         <w:rPr/>
-        <w:t xml:space="preserve">Formalized the standard C-QTc hysteresis check as an exploratory, prespecified test on the established </w:t>
-      </w:r>
-      <w:hyperlink r:id="rId20">
-        <w:r>
-          <w:rPr>
-            <w:color w:val="154D66"/>
-          </w:rPr>
-          <w:t>signed loop area</w:t>
-        </w:r>
-      </w:hyperlink>
-      <w:r>
-        <w:rPr/>
-        <w:t>, with a standard error that allows for the shared time-matched placebo mean. Across 32 synthetic scenarios of 1,000 replicates its size was 0.046, while a one-sample sign-flip test over-rejected (up to 0.236) when the placebo mean was shared. Added SAD/MAD mock shells in SAS and R (SAS not executed); the framing follows the directed-contagion manuscript.</w:t>
+        <w:t>Built an open-source tool that compares how well different kinds of biological data recognize the same gene groups, with statistical testing and replication on nervous-system and immune gene maps.</w:t>
+      </w:r>
+    </w:p>
+    <w:p>
+      <w:pPr>
+        <w:pStyle w:val="Entry"/>
+      </w:pPr>
+      <w:r>
+        <w:rPr>
+          <w:b/>
+        </w:rPr>
+        <w:t>No emotion-specific image-computable code in the human left amygdala.</w:t>
+      </w:r>
+      <w:r>
+        <w:rPr/>
+        <w:t xml:space="preserve"> Peer Community In, preprint review.</w:t>
       </w:r>
     </w:p>
     <w:p>
@@ -650,46 +669,8 @@
       </w:pPr>
       <w:r>
         <w:rPr/>
-        <w:t>Made three R Shiny apps (safety review, IRT/RTSM acceptance tracking and study lifecycle monitoring) run in the browser with Shinylive, with a launch page that reports each loading stage and any failure, and a deploy test that opens every app in headless Chrome and blocks publishing unless all outputs fill; checked in Chrome only. Built an IRT/RTSM user-acceptance test library with traceability and release criteria and a coverage and continuity toolkit that runs in the browser; the SAS/R monitoring macros are not executed.</w:t>
-      </w:r>
-    </w:p>
-    <w:p>
-      <w:pPr>
-        <w:pStyle w:val="Entry"/>
-      </w:pPr>
-      <w:hyperlink r:id="rId21">
-        <w:r>
-          <w:rPr>
-            <w:color w:val="000000"/>
-            <w:b/>
-          </w:rPr>
-          <w:t>eCRF pipeline applications</w:t>
-        </w:r>
-      </w:hyperlink>
-      <w:r>
-        <w:rPr/>
-        <w:t xml:space="preserve"> | </w:t>
-      </w:r>
-      <w:hyperlink r:id="rId22">
-        <w:r>
-          <w:rPr>
-            <w:color w:val="000000"/>
-          </w:rPr>
-          <w:t>Demo overview</w:t>
-        </w:r>
-      </w:hyperlink>
-      <w:r>
-        <w:rPr/>
-        <w:t xml:space="preserve"> | </w:t>
-      </w:r>
-      <w:hyperlink r:id="rId23">
-        <w:r>
-          <w:rPr>
-            <w:color w:val="000000"/>
-          </w:rPr>
-          <w:t>Evaluation</w:t>
-        </w:r>
-      </w:hyperlink>
+        <w:t>Tested whether the human amygdala carries an emotion-specific visual code across three brain-imaging datasets and found no evidence for one, with conclusions limited to the samples and models tested.</w:t>
+      </w:r>
     </w:p>
     <w:p>
       <w:pPr>
@@ -702,7 +683,18 @@
       </w:pPr>
       <w:r>
         <w:rPr/>
-        <w:t>Built four Python (Streamlit) apps: Coding QC assist, De-identification review assist, Participant risk screening and Central statistical monitoring. All four also run in the browser (stlite) on bundled synthetic data with uploads disabled; the model path runs only locally.</w:t>
+        <w:t>Preprint doi:10.5281/zenodo.21422754.</w:t>
+      </w:r>
+    </w:p>
+    <w:p>
+      <w:pPr>
+        <w:pStyle w:val="Entry"/>
+      </w:pPr>
+      <w:r>
+        <w:rPr>
+          <w:b/>
+        </w:rPr>
+        <w:t>Published work</w:t>
       </w:r>
     </w:p>
     <w:p>
@@ -715,8 +707,24 @@
         <w:ind w:left="202" w:hanging="202"/>
       </w:pPr>
       <w:r>
-        <w:rPr/>
-        <w:t>Separated deterministic stand-ins from optional model, Sinkhorn and Isolation Forest paths; public demonstrations and evaluations use synthetic data and placeholder dictionary codes, not MedDRA.</w:t>
+        <w:rPr>
+          <w:b/>
+        </w:rPr>
+        <w:t>Acknowledged contributor:</w:t>
+      </w:r>
+      <w:r>
+        <w:rPr/>
+        <w:t xml:space="preserve"> developed data extraction and normalization programs for the study dataset in Osterhage KP, Hser YI, Mooney LJ, Sherman S, Saxon AJ, Ledgerwood M, Holtzer CC, Gehring MA, Clingan SE, Curtis ME, Baldwin LM. Identifying patients with opioid use disorder using International Classification of Diseases (ICD) codes: challenges and opportunities. </w:t>
+      </w:r>
+      <w:r>
+        <w:rPr>
+          <w:i/>
+        </w:rPr>
+        <w:t>Addiction</w:t>
+      </w:r>
+      <w:r>
+        <w:rPr/>
+        <w:t>. 2024;119(1):160-168. doi:10.1111/add.16338.</w:t>
       </w:r>
     </w:p>
     <w:p>
@@ -729,8 +737,33 @@
         <w:ind w:left="202" w:hanging="202"/>
       </w:pPr>
       <w:r>
-        <w:rPr/>
-        <w:t>Logged input hashes, configuration, paths and thresholds for traceable reruns with retained inputs and software/model artifacts; provided runnable QC.</w:t>
+        <w:rPr>
+          <w:b/>
+        </w:rPr>
+        <w:t>Co-author:</w:t>
+      </w:r>
+      <w:r>
+        <w:rPr/>
+        <w:t xml:space="preserve"> Ben-Avie M, Rosenwald L, Depastino R, Iben P. How can we help young adults with autism thrive in the workplace? </w:t>
+      </w:r>
+      <w:r>
+        <w:rPr>
+          <w:i/>
+        </w:rPr>
+        <w:t>The Conversation</w:t>
+      </w:r>
+      <w:r>
+        <w:rPr/>
+        <w:t>, 2016.</w:t>
+      </w:r>
+    </w:p>
+    <w:p>
+      <w:pPr>
+        <w:pStyle w:val="Heading1"/>
+      </w:pPr>
+      <w:r>
+        <w:rPr/>
+        <w:t>Teaching and research communication</w:t>
       </w:r>
     </w:p>
     <w:p>
@@ -744,528 +777,7 @@
       </w:pPr>
       <w:r>
         <w:rPr/>
-        <w:t>Published measured failure rates on synthetic held-out data: the de-identification stand-in left 108 of 308 identifiers readable (model path 91 of 308), and the coding stand-in ranked the right term first for 54.2% of verbatims (model path 77.8%). A pre-registered within-sibling check, adapted from the AlphaGenome within-site audit, routed both sibling-term families to human coding because neither family cleared the pre-registered 0.90 accuracy floor once uncertainty was counted and the tool was not shown to beat a keyword rule.</w:t>
-      </w:r>
-    </w:p>
-    <w:p>
-      <w:pPr>
-        <w:pStyle w:val="Heading1"/>
-      </w:pPr>
-      <w:r>
-        <w:rPr/>
-        <w:t>Research manuscripts</w:t>
-      </w:r>
-    </w:p>
-    <w:p>
-      <w:pPr/>
-      <w:r>
-        <w:rPr/>
-        <w:t xml:space="preserve">Submission and review statuses as of 26 October 2026. Public drafts, study artifacts, software and teaching materials are mapped in the </w:t>
-      </w:r>
-      <w:hyperlink r:id="rId1">
-        <w:r>
-          <w:rPr>
-            <w:color w:val="154D66"/>
-          </w:rPr>
-          <w:t>research index</w:t>
-        </w:r>
-      </w:hyperlink>
-      <w:r>
-        <w:rPr/>
-        <w:t>.</w:t>
-      </w:r>
-    </w:p>
-    <w:p>
-      <w:pPr>
-        <w:pStyle w:val="Entry"/>
-      </w:pPr>
-      <w:r>
-        <w:rPr>
-          <w:b/>
-        </w:rPr>
-        <w:t>Contamination-resilient cluster randomized trial design under spatial interference: a simulation study of contamination control.</w:t>
-      </w:r>
-      <w:r>
-        <w:rPr/>
-        <w:t xml:space="preserve"> </w:t>
-      </w:r>
-      <w:r>
-        <w:rPr>
-          <w:i/>
-        </w:rPr>
-        <w:t>Statistics in Medicine</w:t>
-      </w:r>
-      <w:r>
-        <w:rPr/>
-        <w:t>, submitted.</w:t>
-      </w:r>
-    </w:p>
-    <w:p>
-      <w:pPr>
-        <w:pStyle w:val="Bullet"/>
-        <w:keepNext/>
-        <w:numPr>
-          <w:ilvl w:val="0"/>
-          <w:numId w:val="1027"/>
-        </w:numPr>
-        <w:ind w:left="202" w:hanging="202"/>
-      </w:pPr>
-      <w:r>
-        <w:rPr/>
-        <w:t>Developed a ten-diagnostic design framework and Monte Carlo comparisons using 57 public Malaria Atlas Project survey sites in Uganda. Evaluated bias, precision, interval coverage and model misspecification, distinguishing headline two-criterion simulations from full-objective cluster searches.</w:t>
-      </w:r>
-    </w:p>
-    <w:p>
-      <w:pPr>
-        <w:pStyle w:val="LinkLine"/>
-        <w:ind w:left="202"/>
-      </w:pPr>
-      <w:hyperlink r:id="rId24">
-        <w:r>
-          <w:rPr>
-            <w:color w:val="154D66"/>
-          </w:rPr>
-          <w:t>Latest preprint</w:t>
-        </w:r>
-      </w:hyperlink>
-      <w:r>
-        <w:rPr/>
-        <w:t xml:space="preserve"> | </w:t>
-      </w:r>
-      <w:hyperlink r:id="rId25">
-        <w:r>
-          <w:rPr>
-            <w:color w:val="154D66"/>
-          </w:rPr>
-          <w:t>Study code and data</w:t>
-        </w:r>
-      </w:hyperlink>
-      <w:r>
-        <w:rPr/>
-        <w:t xml:space="preserve"> | </w:t>
-      </w:r>
-      <w:hyperlink r:id="rId26">
-        <w:r>
-          <w:rPr>
-            <w:color w:val="154D66"/>
-          </w:rPr>
-          <w:t>Interactive design demo</w:t>
-        </w:r>
-      </w:hyperlink>
-      <w:r>
-        <w:rPr/>
-        <w:t xml:space="preserve"> | </w:t>
-      </w:r>
-      <w:hyperlink r:id="rId27">
-        <w:r>
-          <w:rPr>
-            <w:color w:val="154D66"/>
-          </w:rPr>
-          <w:t>Study guide and complete companion</w:t>
-        </w:r>
-      </w:hyperlink>
-    </w:p>
-    <w:p>
-      <w:pPr>
-        <w:pStyle w:val="Entry"/>
-      </w:pPr>
-      <w:r>
-        <w:rPr>
-          <w:b/>
-        </w:rPr>
-        <w:t>What do within-site comparisons of AlphaGenome Atlas predictions measure? An audit at ClinVar sites in 11 genes.</w:t>
-      </w:r>
-      <w:r>
-        <w:rPr/>
-        <w:t xml:space="preserve"> </w:t>
-      </w:r>
-      <w:r>
-        <w:rPr>
-          <w:i/>
-        </w:rPr>
-        <w:t>Human Genomics</w:t>
-      </w:r>
-      <w:r>
-        <w:rPr/>
-        <w:t>, submitted.</w:t>
-      </w:r>
-    </w:p>
-    <w:p>
-      <w:pPr>
-        <w:pStyle w:val="Bullet"/>
-        <w:keepNext/>
-        <w:numPr>
-          <w:ilvl w:val="0"/>
-          <w:numId w:val="1027"/>
-        </w:numPr>
-        <w:ind w:left="202" w:hanging="202"/>
-      </w:pPr>
-      <w:r>
-        <w:rPr/>
-        <w:t>Audited within-site allele comparisons across 22 scorers using permutation nulls and consequence/geometry controls. Added held-out same-gene and seven-gene replications, distinguishing benchmark discrimination from clinical validity. The browser demo recomputes cached initial-cohort statistics.</w:t>
-      </w:r>
-    </w:p>
-    <w:p>
-      <w:pPr>
-        <w:pStyle w:val="LinkLine"/>
-        <w:ind w:left="202"/>
-      </w:pPr>
-      <w:hyperlink r:id="rId28">
-        <w:r>
-          <w:rPr>
-            <w:color w:val="154D66"/>
-          </w:rPr>
-          <w:t>Latest preprint</w:t>
-        </w:r>
-      </w:hyperlink>
-      <w:r>
-        <w:rPr/>
-        <w:t xml:space="preserve"> | </w:t>
-      </w:r>
-      <w:hyperlink r:id="rId29">
-        <w:r>
-          <w:rPr>
-            <w:color w:val="154D66"/>
-          </w:rPr>
-          <w:t>Study code and data</w:t>
-        </w:r>
-      </w:hyperlink>
-      <w:r>
-        <w:rPr/>
-        <w:t xml:space="preserve"> | </w:t>
-      </w:r>
-      <w:hyperlink r:id="rId30">
-        <w:r>
-          <w:rPr>
-            <w:color w:val="154D66"/>
-          </w:rPr>
-          <w:t>Interactive allele demo</w:t>
-        </w:r>
-      </w:hyperlink>
-      <w:r>
-        <w:rPr/>
-        <w:t xml:space="preserve"> | </w:t>
-      </w:r>
-      <w:hyperlink r:id="rId31">
-        <w:r>
-          <w:rPr>
-            <w:color w:val="154D66"/>
-          </w:rPr>
-          <w:t>Study guide and complete companion</w:t>
-        </w:r>
-      </w:hyperlink>
-    </w:p>
-    <w:p>
-      <w:pPr>
-        <w:pStyle w:val="Entry"/>
-      </w:pPr>
-      <w:r>
-        <w:rPr>
-          <w:b/>
-        </w:rPr>
-        <w:t>A false floor: Refuting our own information-limit claim in a lethal identification task.</w:t>
-      </w:r>
-      <w:r>
-        <w:rPr/>
-        <w:t xml:space="preserve"> Submitted to PLOS ONE, 22 October 2026.</w:t>
-      </w:r>
-    </w:p>
-    <w:p>
-      <w:pPr>
-        <w:pStyle w:val="Bullet"/>
-        <w:keepNext/>
-        <w:numPr>
-          <w:ilvl w:val="0"/>
-          <w:numId w:val="1027"/>
-        </w:numPr>
-        <w:ind w:left="202" w:hanging="202"/>
-      </w:pPr>
-      <w:r>
-        <w:rPr/>
-        <w:t>Developed stronger-baseline counterexamples to an earlier image-information-limit claim, making yield-constrained errors and repeated-split uncertainty explicit. Added training-catalog overlap measurements and a model-coded literature audit, retaining provenance and field-safety limitations.</w:t>
-      </w:r>
-    </w:p>
-    <w:p>
-      <w:pPr>
-        <w:pStyle w:val="LinkLine"/>
-        <w:ind w:left="202"/>
-      </w:pPr>
-      <w:hyperlink r:id="rId32">
-        <w:r>
-          <w:rPr>
-            <w:color w:val="154D66"/>
-          </w:rPr>
-          <w:t>Latest preprint</w:t>
-        </w:r>
-      </w:hyperlink>
-      <w:r>
-        <w:rPr/>
-        <w:t xml:space="preserve"> | </w:t>
-      </w:r>
-      <w:hyperlink r:id="rId33">
-        <w:r>
-          <w:rPr>
-            <w:color w:val="154D66"/>
-          </w:rPr>
-          <w:t>Provenance and training-catalog overlap records</w:t>
-        </w:r>
-      </w:hyperlink>
-      <w:r>
-        <w:rPr/>
-        <w:t xml:space="preserve"> | </w:t>
-      </w:r>
-      <w:hyperlink r:id="rId34">
-        <w:r>
-          <w:rPr>
-            <w:color w:val="154D66"/>
-          </w:rPr>
-          <w:t>Study guide and complete companion</w:t>
-        </w:r>
-      </w:hyperlink>
-    </w:p>
-    <w:p>
-      <w:pPr>
-        <w:pStyle w:val="Entry"/>
-      </w:pPr>
-      <w:r>
-        <w:rPr>
-          <w:b/>
-        </w:rPr>
-        <w:t>Anticipating network contagions: when directedness outperforms connectedness.</w:t>
-      </w:r>
-      <w:r>
-        <w:rPr/>
-        <w:t xml:space="preserve"> </w:t>
-      </w:r>
-      <w:r>
-        <w:rPr>
-          <w:i/>
-        </w:rPr>
-        <w:t>Applied Network Science</w:t>
-      </w:r>
-      <w:r>
-        <w:rPr/>
-        <w:t>, with editor.</w:t>
-      </w:r>
-    </w:p>
-    <w:p>
-      <w:pPr>
-        <w:pStyle w:val="Bullet"/>
-        <w:keepNext/>
-        <w:numPr>
-          <w:ilvl w:val="0"/>
-          <w:numId w:val="1027"/>
-        </w:numPr>
-        <w:ind w:left="202" w:hanging="202"/>
-      </w:pPr>
-      <w:r>
-        <w:rPr/>
-        <w:t>Developed a directional-asymmetry diagnostic and evaluated transmitter-targeted versus worst-hit control in non-negative VAR surrogates fitted to seven contagion datasets. Combined generalized connectedness, symmetrization controls and dated prediction-first records; intervention benefits were simulated.</w:t>
-      </w:r>
-    </w:p>
-    <w:p>
-      <w:pPr>
-        <w:pStyle w:val="LinkLine"/>
-        <w:ind w:left="202"/>
-      </w:pPr>
-      <w:hyperlink r:id="rId35">
-        <w:r>
-          <w:rPr>
-            <w:color w:val="154D66"/>
-          </w:rPr>
-          <w:t>Author draft</w:t>
-        </w:r>
-      </w:hyperlink>
-      <w:r>
-        <w:rPr/>
-        <w:t xml:space="preserve"> | </w:t>
-      </w:r>
-      <w:hyperlink r:id="rId36">
-        <w:r>
-          <w:rPr>
-            <w:color w:val="154D66"/>
-          </w:rPr>
-          <w:t>Code and data</w:t>
-        </w:r>
-      </w:hyperlink>
-      <w:r>
-        <w:rPr/>
-        <w:t xml:space="preserve"> | </w:t>
-      </w:r>
-      <w:hyperlink r:id="rId37">
-        <w:r>
-          <w:rPr>
-            <w:color w:val="154D66"/>
-          </w:rPr>
-          <w:t>Prospective records</w:t>
-        </w:r>
-      </w:hyperlink>
-      <w:r>
-        <w:rPr/>
-        <w:t xml:space="preserve"> | </w:t>
-      </w:r>
-      <w:hyperlink r:id="rId38">
-        <w:r>
-          <w:rPr>
-            <w:color w:val="154D66"/>
-          </w:rPr>
-          <w:t>Study guide and complete companion</w:t>
-        </w:r>
-      </w:hyperlink>
-    </w:p>
-    <w:p>
-      <w:pPr>
-        <w:pStyle w:val="Entry"/>
-      </w:pPr>
-      <w:r>
-        <w:rPr>
-          <w:b/>
-        </w:rPr>
-        <w:t>Which data modality recognizes a gene set? A domain-agnostic consilience engine.</w:t>
-      </w:r>
-      <w:r>
-        <w:rPr/>
-        <w:t xml:space="preserve"> </w:t>
-      </w:r>
-      <w:r>
-        <w:rPr>
-          <w:i/>
-        </w:rPr>
-        <w:t>PeerJ</w:t>
-      </w:r>
-      <w:r>
-        <w:rPr/>
-        <w:t>, in peer review.</w:t>
-      </w:r>
-    </w:p>
-    <w:p>
-      <w:pPr>
-        <w:pStyle w:val="Bullet"/>
-        <w:keepNext/>
-        <w:numPr>
-          <w:ilvl w:val="0"/>
-          <w:numId w:val="1027"/>
-        </w:numPr>
-        <w:ind w:left="202" w:hanging="202"/>
-      </w:pPr>
-      <w:r>
-        <w:rPr/>
-        <w:t>Built a configurable Python engine comparing gene-group coherence across protein-domain annotations, cell-type expression, interaction associations and biological-process annotations. Applied permutation inference, multiplicity control, class-recovery analyses and method-sensitivity checks to nervous-system and immune maps.</w:t>
-      </w:r>
-    </w:p>
-    <w:p>
-      <w:pPr>
-        <w:pStyle w:val="LinkLine"/>
-        <w:ind w:left="202"/>
-      </w:pPr>
-      <w:hyperlink r:id="rId39">
-        <w:r>
-          <w:rPr>
-            <w:color w:val="154D66"/>
-          </w:rPr>
-          <w:t>Author draft</w:t>
-        </w:r>
-      </w:hyperlink>
-      <w:r>
-        <w:rPr/>
-        <w:t xml:space="preserve"> | </w:t>
-      </w:r>
-      <w:hyperlink r:id="rId40">
-        <w:r>
-          <w:rPr>
-            <w:color w:val="154D66"/>
-          </w:rPr>
-          <w:t>Code and reproduction instructions</w:t>
-        </w:r>
-      </w:hyperlink>
-      <w:r>
-        <w:rPr/>
-        <w:t xml:space="preserve"> | </w:t>
-      </w:r>
-      <w:hyperlink r:id="rId41">
-        <w:r>
-          <w:rPr>
-            <w:color w:val="154D66"/>
-          </w:rPr>
-          <w:t>Study guide and complete companion</w:t>
-        </w:r>
-      </w:hyperlink>
-    </w:p>
-    <w:p>
-      <w:pPr>
-        <w:pStyle w:val="Entry"/>
-      </w:pPr>
-      <w:r>
-        <w:rPr>
-          <w:b/>
-        </w:rPr>
-        <w:t>No emotion-specific image-computable code in the human left amygdala.</w:t>
-      </w:r>
-      <w:r>
-        <w:rPr/>
-        <w:t xml:space="preserve"> Peer Community In, preprint review.</w:t>
-      </w:r>
-    </w:p>
-    <w:p>
-      <w:pPr>
-        <w:pStyle w:val="Bullet"/>
-        <w:keepNext/>
-        <w:numPr>
-          <w:ilvl w:val="0"/>
-          <w:numId w:val="1027"/>
-        </w:numPr>
-        <w:ind w:left="202" w:hanging="202"/>
-      </w:pPr>
-      <w:r>
-        <w:rPr/>
-        <w:t>Evaluated encoder-specific prediction and cross-encoder corroboration across three datasets and four analysis arms. Distinguished corrected movie effects from stronger left-amygdala session-based contrasts, with conclusions restricted to tested samples and representations.</w:t>
-      </w:r>
-    </w:p>
-    <w:p>
-      <w:pPr>
-        <w:pStyle w:val="LinkLine"/>
-        <w:ind w:left="202"/>
-      </w:pPr>
-      <w:hyperlink r:id="rId42">
-        <w:r>
-          <w:rPr>
-            <w:color w:val="154D66"/>
-          </w:rPr>
-          <w:t>Latest preprint</w:t>
-        </w:r>
-      </w:hyperlink>
-      <w:r>
-        <w:rPr/>
-        <w:t xml:space="preserve"> | </w:t>
-      </w:r>
-      <w:hyperlink r:id="rId43">
-        <w:r>
-          <w:rPr>
-            <w:color w:val="154D66"/>
-          </w:rPr>
-          <w:t>Code and reconstruction runbooks</w:t>
-        </w:r>
-      </w:hyperlink>
-      <w:r>
-        <w:rPr/>
-        <w:t xml:space="preserve"> | </w:t>
-      </w:r>
-      <w:hyperlink r:id="rId44">
-        <w:r>
-          <w:rPr>
-            <w:color w:val="154D66"/>
-          </w:rPr>
-          <w:t>Study guide and complete companion</w:t>
-        </w:r>
-      </w:hyperlink>
-    </w:p>
-    <w:p>
-      <w:pPr>
-        <w:pStyle w:val="Heading1"/>
-      </w:pPr>
-      <w:r>
-        <w:rPr/>
-        <w:t>Teaching and research communication</w:t>
+        <w:t>Authored six concise study guides and six complete educational companions tied to exact manuscript versions. All twelve editions are publicly available. The teaching sets include worked examples, answered exercises, glossaries and source-coverage maps.</w:t>
       </w:r>
     </w:p>
     <w:p>
@@ -1279,7 +791,7 @@
       </w:pPr>
       <w:r>
         <w:rPr/>
-        <w:t>Authored six concise study guides and six complete educational companions tied to exact manuscript versions. All twelve editions are publicly available. The teaching sets include worked examples, answered exercises, glossaries and source-coverage maps.</w:t>
+        <w:t>Connected manuscripts to code, data deposits, interactive demonstrations and teaching editions through a public research index. The CRT complete companion spans 97 pages; the other studies have their own full methods walkthroughs.</w:t>
       </w:r>
     </w:p>
     <w:p>
@@ -1293,19 +805,34 @@
       </w:pPr>
       <w:r>
         <w:rPr/>
-        <w:t xml:space="preserve">Connected manuscripts to code, data deposits, interactive demonstrations and teaching editions through a public </w:t>
-      </w:r>
-      <w:hyperlink r:id="rId1">
-        <w:r>
-          <w:rPr>
-            <w:color w:val="154D66"/>
-          </w:rPr>
-          <w:t>research index</w:t>
-        </w:r>
-      </w:hyperlink>
-      <w:r>
-        <w:rPr/>
-        <w:t>. The CRT complete companion spans 97 pages; the other studies have their own full methods walkthroughs.</w:t>
+        <w:t>Developed interactive statistical demonstrations and domain-specific explanations of the ten parameters used in response planning, supporting hover, keyboard focus and touch interaction.</w:t>
+      </w:r>
+    </w:p>
+    <w:p>
+      <w:pPr>
+        <w:pStyle w:val="Heading1"/>
+      </w:pPr>
+      <w:r>
+        <w:rPr/>
+        <w:t>Research engineering and scientific software</w:t>
+      </w:r>
+    </w:p>
+    <w:p>
+      <w:pPr>
+        <w:pStyle w:val="Entry"/>
+      </w:pPr>
+      <w:r>
+        <w:rPr>
+          <w:b/>
+        </w:rPr>
+        <w:t>Trial biostatistics toolkit and eCRF review apps</w:t>
+      </w:r>
+    </w:p>
+    <w:p>
+      <w:pPr/>
+      <w:r>
+        <w:rPr/>
+        <w:t>A public toolkit for biostatistics consultants: runnable SAS and R templates, dashboards and QC checks for the work a biostatistician does for a client across an early-phase trial, from the protocol's statistical sections to CSR text. It runs from static files or local R, so client data never leave the analyst's machine; the example studies are synthetic.</w:t>
       </w:r>
     </w:p>
     <w:p>
@@ -1319,43 +846,8 @@
       </w:pPr>
       <w:r>
         <w:rPr/>
-        <w:t>Developed interactive statistical demonstrations and domain-specific explanations of the ten parameters used in response planning, supporting hover, keyboard focus and touch interaction.</w:t>
-      </w:r>
-    </w:p>
-    <w:p>
-      <w:pPr>
-        <w:pStyle w:val="Heading1"/>
-      </w:pPr>
-      <w:r>
-        <w:rPr/>
-        <w:t>Research engineering and scientific software</w:t>
-      </w:r>
-    </w:p>
-    <w:p>
-      <w:pPr>
-        <w:pStyle w:val="Entry"/>
-      </w:pPr>
-      <w:hyperlink r:id="rId45">
-        <w:r>
-          <w:rPr>
-            <w:color w:val="000000"/>
-            <w:b/>
-          </w:rPr>
-          <w:t>Public Data Consoles</w:t>
-        </w:r>
-      </w:hyperlink>
-      <w:r>
-        <w:rPr/>
-        <w:t xml:space="preserve"> | </w:t>
-      </w:r>
-      <w:hyperlink r:id="rId46">
-        <w:r>
-          <w:rPr>
-            <w:color w:val="000000"/>
-          </w:rPr>
-          <w:t>Source</w:t>
-        </w:r>
-      </w:hyperlink>
+        <w:t>Built a complete worked example of a bioequivalence study: one synthetic trial taken from sample size and randomization through the analysis plan, analysis datasets, pharmacokinetic analysis, tables and report text, all regenerated by a single script.</w:t>
+      </w:r>
     </w:p>
     <w:p>
       <w:pPr>
@@ -1368,7 +860,7 @@
       </w:pPr>
       <w:r>
         <w:rPr/>
-        <w:t>Built 32 self-contained browser consoles spanning hazards, infrastructure, health-system strain, public health, access to care and markets. Examples include river-flood propagation, earthquake consequences, U.S. grid strain, NHS Scotland hospital strain, CDC surveillance and the World Bank global-health atlas.</w:t>
+        <w:t>Built safety-monitoring tools for first-in-human studies: liver and cardiac screening rules, a Safety Review Committee packet and an interactive dashboard that runs in the browser.</w:t>
       </w:r>
     </w:p>
     <w:p>
@@ -1382,7 +874,7 @@
       </w:pPr>
       <w:r>
         <w:rPr/>
-        <w:t>Integrated public observations, source-issued forecasts, published estimates and dated snapshots; implemented scheduled data publication, schema and timestamp checks, fallback behavior and source-specific freshness displays. Visitors need no provider API key.</w:t>
+        <w:t>Built a quality-control harness that recomputes key results a second way and is tested against deliberately planted errors.</w:t>
       </w:r>
     </w:p>
     <w:p>
@@ -1396,7 +888,7 @@
       </w:pPr>
       <w:r>
         <w:rPr/>
-        <w:t>Adapted the ten-parameter planning framework across all 32 consoles. Response plans prioritize supported actions using the selected data, with review timing, escalation triggers, public/operator tracks and explanations of each parameter's practical relevance.</w:t>
+        <w:t>Wrote SAS and R program libraries for standard tables, listings and figures across common early-phase designs, plus simulation studies of two regulatory checks.</w:t>
       </w:r>
     </w:p>
     <w:p>
@@ -1410,22 +902,19 @@
       </w:pPr>
       <w:r>
         <w:rPr/>
-        <w:t>Added mobile usability and keyboard/touch-accessible explanations; used catalog, unit and browser checks to verify source handling, plans and unavailable-feed states.</w:t>
+        <w:t>Built four browser-based apps for reviewing clinical trial data (medical coding, de-identification, participant risk and central monitoring) and published their measured limitations.</w:t>
       </w:r>
     </w:p>
     <w:p>
       <w:pPr>
         <w:pStyle w:val="Entry"/>
       </w:pPr>
-      <w:hyperlink r:id="rId47">
-        <w:r>
-          <w:rPr>
-            <w:color w:val="000000"/>
-            <w:b/>
-          </w:rPr>
-          <w:t>Coastal Water Resilience</w:t>
-        </w:r>
-      </w:hyperlink>
+      <w:r>
+        <w:rPr>
+          <w:b/>
+        </w:rPr>
+        <w:t>Public Data Consoles</w:t>
+      </w:r>
     </w:p>
     <w:p>
       <w:pPr>
@@ -1438,7 +927,7 @@
       </w:pPr>
       <w:r>
         <w:rPr/>
-        <w:t>Combined CRT spatial-exposure principles and source/sink concepts informed by network-contagion research in an infrastructure planning console.</w:t>
+        <w:t>Built 32 self-contained, browser-only decision-support consoles spanning hazards, infrastructure, health-system strain, public health, access to care and markets; each labels every input as measured, modeled or demonstration. Examples include river-flood propagation, earthquake consequences, U.S. grid strain, NHS Scotland hospital strain, CDC surveillance and the World Bank global-health atlas.</w:t>
       </w:r>
     </w:p>
     <w:p>
@@ -1452,7 +941,7 @@
       </w:pPr>
       <w:r>
         <w:rPr/>
-        <w:t>Joined official public wastewater-station inventories to evacuation zones, USGS terrain and source-defined sewer basins, alongside NOAA/NWS observations and forecasts. Linked projected-impact screens to the same station scope used by the ten-parameter response plans.</w:t>
+        <w:t>Integrated public observations, source-issued forecasts, published estimates and dated snapshots; implemented scheduled data publication, schema and timestamp checks, fallback behavior and source-specific freshness displays. Visitors need no provider API key.</w:t>
       </w:r>
     </w:p>
     <w:p>
@@ -1466,7 +955,7 @@
       </w:pPr>
       <w:r>
         <w:rPr/>
-        <w:t>Incorporated Census population context and published annual treatment flows while distinguishing geographic exposure from operational outages, customer losses and hydraulic connectivity. The synthetic exercise remains a separately labeled demonstration.</w:t>
+        <w:t>Adapted the ten-parameter planning framework across all 32 consoles. Response plans prioritize supported actions using the selected data, with review timing, escalation triggers, public/operator tracks and explanations of each parameter's practical relevance.</w:t>
       </w:r>
     </w:p>
     <w:p>
@@ -1480,34 +969,19 @@
       </w:pPr>
       <w:r>
         <w:rPr/>
-        <w:t>Connected parameters to phase-specific actions, explaining why a diagnostic matters at a particular timepoint and when to recheck or escalate.</w:t>
+        <w:t>Added mobile usability and keyboard/touch-accessible explanations; used catalog, unit and browser checks to verify source handling, plans and unavailable-feed states.</w:t>
       </w:r>
     </w:p>
     <w:p>
       <w:pPr>
         <w:pStyle w:val="Entry"/>
       </w:pPr>
-      <w:hyperlink r:id="rId48">
-        <w:r>
-          <w:rPr>
-            <w:color w:val="000000"/>
-            <w:b/>
-          </w:rPr>
-          <w:t>Autonomic Telemetry</w:t>
-        </w:r>
-      </w:hyperlink>
-      <w:r>
-        <w:rPr/>
-        <w:t xml:space="preserve"> | </w:t>
-      </w:r>
-      <w:hyperlink r:id="rId49">
-        <w:r>
-          <w:rPr>
-            <w:color w:val="000000"/>
-          </w:rPr>
-          <w:t>Source</w:t>
-        </w:r>
-      </w:hyperlink>
+      <w:r>
+        <w:rPr>
+          <w:b/>
+        </w:rPr>
+        <w:t>Coastal Water Resilience</w:t>
+      </w:r>
     </w:p>
     <w:p>
       <w:pPr>
@@ -1520,7 +994,7 @@
       </w:pPr>
       <w:r>
         <w:rPr/>
-        <w:t>Built a local wearable-to-browser system using Bluetooth adapters, an in-memory Mac bridge and mobile visualization, with Work/Rest views and a fixed personal reference.</w:t>
+        <w:t>Unified my two research methods in Coastal Water Resilience: the ten-metric diagnostic suite from my contamination-resilient cluster randomized trial design, combined with directed source/sink topology accounting from my directed-contagion research, applied to live NOAA, NHC and NWS coastal forecasts across 131 published station locations, with terrain, evacuation zones and Census context driving projected impacts and response plans.</w:t>
       </w:r>
     </w:p>
     <w:p>
@@ -1534,7 +1008,7 @@
       </w:pPr>
       <w:r>
         <w:rPr/>
-        <w:t>Implemented source identity, freshness, signal-quality and channel-coverage controls, plus missing-channel handling and replayable feature exports. The physiological-pattern estimate is experimental.</w:t>
+        <w:t>Joined official public wastewater-station inventories to evacuation zones, USGS terrain and source-defined sewer basins, alongside NOAA/NWS observations and forecasts. Linked projected-impact screens to the same station scope used by the ten-parameter response plans.</w:t>
       </w:r>
     </w:p>
     <w:p>
@@ -1548,46 +1022,8 @@
       </w:pPr>
       <w:r>
         <w:rPr/>
-        <w:t xml:space="preserve">Built a separate </w:t>
-      </w:r>
-      <w:hyperlink r:id="rId50">
-        <w:r>
-          <w:rPr>
-            <w:color w:val="154D66"/>
-          </w:rPr>
-          <w:t>Signal Lab</w:t>
-        </w:r>
-      </w:hyperlink>
-      <w:r>
-        <w:rPr/>
-        <w:t xml:space="preserve"> with numerical lenses, analytic checks and regression tests. Live wearable input runs through the local bridge.</w:t>
-      </w:r>
-    </w:p>
-    <w:p>
-      <w:pPr>
-        <w:pStyle w:val="Entry"/>
-      </w:pPr>
-      <w:hyperlink r:id="rId51">
-        <w:r>
-          <w:rPr>
-            <w:color w:val="000000"/>
-            <w:b/>
-          </w:rPr>
-          <w:t>Resilience Telemetry</w:t>
-        </w:r>
-      </w:hyperlink>
-      <w:r>
-        <w:rPr/>
-        <w:t xml:space="preserve"> | </w:t>
-      </w:r>
-      <w:hyperlink r:id="rId52">
-        <w:r>
-          <w:rPr>
-            <w:color w:val="000000"/>
-          </w:rPr>
-          <w:t>Method correspondence</w:t>
-        </w:r>
-      </w:hyperlink>
+        <w:t>Incorporated Census population context and published annual treatment flows while distinguishing geographic exposure from operational outages, customer losses and hydraulic connectivity. The synthetic exercise remains a separately labeled demonstration.</w:t>
+      </w:r>
     </w:p>
     <w:p>
       <w:pPr>
@@ -1600,7 +1036,18 @@
       </w:pPr>
       <w:r>
         <w:rPr/>
-        <w:t>Implemented cross-asset fragility diagnostics, directed volatility networks, transmitter stability, historical replay and held-out comparisons against highest-volatility and persistence baselines.</w:t>
+        <w:t>Connected parameters to phase-specific actions, explaining why a diagnostic matters at a particular timepoint and when to recheck or escalate.</w:t>
+      </w:r>
+    </w:p>
+    <w:p>
+      <w:pPr>
+        <w:pStyle w:val="Entry"/>
+      </w:pPr>
+      <w:r>
+        <w:rPr>
+          <w:b/>
+        </w:rPr>
+        <w:t>Autonomic Telemetry</w:t>
       </w:r>
     </w:p>
     <w:p>
@@ -1614,22 +1061,8 @@
       </w:pPr>
       <w:r>
         <w:rPr/>
-        <w:t>Integrated public market and macroeconomic data with source timestamps and interpretation limits. The ridge-regularized VAR/FEVD implementation is an exploratory adaptation of the network-contagion research; the manuscript's non-negative VAR intervention experiments are documented separately.</w:t>
-      </w:r>
-    </w:p>
-    <w:p>
-      <w:pPr>
-        <w:pStyle w:val="Entry"/>
-      </w:pPr>
-      <w:hyperlink r:id="rId40">
-        <w:r>
-          <w:rPr>
-            <w:color w:val="000000"/>
-            <w:b/>
-          </w:rPr>
-          <w:t>Consilience Engine</w:t>
-        </w:r>
-      </w:hyperlink>
+        <w:t>Built a personal arousal-biofeedback system for work and rest: a multivariate arousal estimate combining heart rate, heart-rate variability (RMSSD, SDNN), EEG beta/alpha and covariance distance against a two-minute personal reference, with prediction-error event detection; a local Mac-to-iPhone bridge streams live input from a Muse S headband and a Hume Band, and a Signal Lab replays recordings exactly.</w:t>
+      </w:r>
     </w:p>
     <w:p>
       <w:pPr>
@@ -1642,7 +1075,7 @@
       </w:pPr>
       <w:r>
         <w:rPr/>
-        <w:t>Packaged gene-set analysis as an installable Python library and configurable CLI with offline cache support. Constructed modality-specific graphs from InterPro, Human Protein Atlas, STRING and Gene Ontology sources, with permutation-null separation and class-recovery analyses.</w:t>
+        <w:t>Implemented source identity, freshness, signal-quality and channel-coverage controls, plus missing-channel handling and replayable feature exports. The physiological-pattern estimate is experimental.</w:t>
       </w:r>
     </w:p>
     <w:p>
@@ -1656,16 +1089,18 @@
       </w:pPr>
       <w:r>
         <w:rPr/>
-        <w:t>Applied the framework to a 410-gene nervous-system map and a 132-gene immune replication. Added unit, property and metamorphic tests, clustering-sensitivity analyses, numerical tolerance checks and reproducibility manifests.</w:t>
-      </w:r>
-    </w:p>
-    <w:p>
-      <w:pPr>
-        <w:pStyle w:val="Heading1"/>
-      </w:pPr>
-      <w:r>
-        <w:rPr/>
-        <w:t>Programming and evaluation skills</w:t>
+        <w:t>Built a separate Signal Lab with numerical lenses, analytic checks and regression tests. Live wearable input runs through the local bridge.</w:t>
+      </w:r>
+    </w:p>
+    <w:p>
+      <w:pPr>
+        <w:pStyle w:val="Entry"/>
+      </w:pPr>
+      <w:r>
+        <w:rPr>
+          <w:b/>
+        </w:rPr>
+        <w:t>Resilience Telemetry</w:t>
       </w:r>
     </w:p>
     <w:p>
@@ -1678,14 +1113,8 @@
         <w:ind w:left="202" w:hanging="202"/>
       </w:pPr>
       <w:r>
-        <w:rPr>
-          <w:b/>
-        </w:rPr>
-        <w:t>Programming and engineering:</w:t>
-      </w:r>
-      <w:r>
-        <w:rPr/>
-        <w:t xml:space="preserve"> R (tidyverse, pharmaverse and Shiny), Quarto, SAS (Base, Macro, STAT, SQL), Python, SQL, JavaScript, LaTeX, Git, Docker, high-performance computing, public API integration and browser testing.</w:t>
+        <w:rPr/>
+        <w:t>Applied my directed-contagion research to cross-asset market volatility: spillover networks, transmitter stability and historical replay, tested against held-out baselines that track the loudest and the most persistent assets.</w:t>
       </w:r>
     </w:p>
     <w:p>
@@ -1698,23 +1127,19 @@
         <w:ind w:left="202" w:hanging="202"/>
       </w:pPr>
       <w:r>
+        <w:rPr/>
+        <w:t>Integrated public market and macroeconomic data with source timestamps and interpretation limits. The ridge-regularized VAR/FEVD implementation is an exploratory adaptation of the network-contagion research; the manuscript's non-negative VAR intervention experiments are documented separately.</w:t>
+      </w:r>
+    </w:p>
+    <w:p>
+      <w:pPr>
+        <w:pStyle w:val="Entry"/>
+      </w:pPr>
+      <w:r>
         <w:rPr>
           <w:b/>
         </w:rPr>
-        <w:t>AI evaluation:</w:t>
-      </w:r>
-      <w:r>
-        <w:rPr/>
-        <w:t xml:space="preserve"> numeric grounding, provenance auditing, retrieval evaluation, model comparison, synthetic-oracle checks and reproducibility testing.</w:t>
-      </w:r>
-    </w:p>
-    <w:p>
-      <w:pPr>
-        <w:pStyle w:val="Heading1"/>
-      </w:pPr>
-      <w:r>
-        <w:rPr/>
-        <w:t>AI evaluation tools</w:t>
+        <w:t>Consilience Engine</w:t>
       </w:r>
     </w:p>
     <w:p>
@@ -1726,24 +1151,9 @@
         </w:numPr>
         <w:ind w:left="202" w:hanging="202"/>
       </w:pPr>
-      <w:hyperlink r:id="rId53">
-        <w:r>
-          <w:rPr>
-            <w:color w:val="154D66"/>
-            <w:b/>
-          </w:rPr>
-          <w:t>numguard</w:t>
-        </w:r>
-      </w:hyperlink>
-      <w:r>
-        <w:rPr>
-          <w:b/>
-        </w:rPr>
-        <w:t>.</w:t>
-      </w:r>
-      <w:r>
-        <w:rPr/>
-        <w:t xml:space="preserve"> Implemented dependency-free numeric-membership, required-fact and finite phrase-denylist checks, with declarative cases, JUnit/JSON reports and CI exit codes.</w:t>
+      <w:r>
+        <w:rPr/>
+        <w:t>Packaged gene-set analysis as an installable Python library and configurable CLI with offline cache support. Constructed modality-specific graphs from InterPro, Human Protein Atlas, STRING and Gene Ontology sources, with permutation-null separation and class-recovery analyses.</w:t>
       </w:r>
     </w:p>
     <w:p>
@@ -1755,24 +1165,18 @@
         </w:numPr>
         <w:ind w:left="202" w:hanging="202"/>
       </w:pPr>
-      <w:hyperlink r:id="rId54">
-        <w:r>
-          <w:rPr>
-            <w:color w:val="154D66"/>
-            <w:b/>
-          </w:rPr>
-          <w:t>guarded-llm-service</w:t>
-        </w:r>
-      </w:hyperlink>
-      <w:r>
-        <w:rPr>
-          <w:b/>
-        </w:rPr>
-        <w:t>.</w:t>
-      </w:r>
-      <w:r>
-        <w:rPr/>
-        <w:t xml:space="preserve"> Served the guard over FastAPI with evaluation and health endpoints, Prometheus-style metrics, a non-root Docker image and container smoke tests.</w:t>
+      <w:r>
+        <w:rPr/>
+        <w:t>Applied the framework to a 410-gene nervous-system map and a 132-gene immune replication. Added unit, property and metamorphic tests, clustering-sensitivity analyses, numerical tolerance checks and reproducibility manifests.</w:t>
+      </w:r>
+    </w:p>
+    <w:p>
+      <w:pPr>
+        <w:pStyle w:val="Heading1"/>
+      </w:pPr>
+      <w:r>
+        <w:rPr/>
+        <w:t>Programming and evaluation skills</w:t>
       </w:r>
     </w:p>
     <w:p>
@@ -1784,24 +1188,15 @@
         </w:numPr>
         <w:ind w:left="202" w:hanging="202"/>
       </w:pPr>
-      <w:hyperlink r:id="rId55">
-        <w:r>
-          <w:rPr>
-            <w:color w:val="154D66"/>
-            <w:b/>
-          </w:rPr>
-          <w:t>tool-grounded-agent</w:t>
-        </w:r>
-      </w:hyperlink>
       <w:r>
         <w:rPr>
           <w:b/>
         </w:rPr>
-        <w:t>.</w:t>
-      </w:r>
-      <w:r>
-        <w:rPr/>
-        <w:t xml:space="preserve"> Built a scripted planning prototype with tool-ledger provenance, a text guard and known-gap tests separating value membership from retrieved evidence.</w:t>
+        <w:t>Programming and engineering:</w:t>
+      </w:r>
+      <w:r>
+        <w:rPr/>
+        <w:t xml:space="preserve"> R (tidyverse, pharmaverse and Shiny), Quarto, SAS (Base, Macro, STAT, SQL), Python, SQL, JavaScript, LaTeX, Git, Docker, high-performance computing, public API integration and browser testing.</w:t>
       </w:r>
     </w:p>
     <w:p>
@@ -1813,128 +1208,15 @@
         </w:numPr>
         <w:ind w:left="202" w:hanging="202"/>
       </w:pPr>
-      <w:hyperlink r:id="rId56">
-        <w:r>
-          <w:rPr>
-            <w:color w:val="154D66"/>
-            <w:b/>
-          </w:rPr>
-          <w:t>grounded-rag</w:t>
-        </w:r>
-      </w:hyperlink>
       <w:r>
         <w:rPr>
           <w:b/>
         </w:rPr>
-        <w:t>.</w:t>
-      </w:r>
-      <w:r>
-        <w:rPr/>
-        <w:t xml:space="preserve"> Implemented lexical retrieval and extractive answering with retrieval metrics, numeric-membership checks and lexical-support evaluation.</w:t>
-      </w:r>
-    </w:p>
-    <w:p>
-      <w:pPr>
-        <w:pStyle w:val="Bullet"/>
-        <w:numPr>
-          <w:ilvl w:val="0"/>
-          <w:numId w:val="1027"/>
-        </w:numPr>
-        <w:ind w:left="202" w:hanging="202"/>
-      </w:pPr>
-      <w:hyperlink r:id="rId57">
-        <w:r>
-          <w:rPr>
-            <w:color w:val="154D66"/>
-            <w:b/>
-          </w:rPr>
-          <w:t>calibrated-clinical-ml</w:t>
-        </w:r>
-      </w:hyperlink>
-      <w:r>
-        <w:rPr>
-          <w:b/>
-        </w:rPr>
-        <w:t>.</w:t>
-      </w:r>
-      <w:r>
-        <w:rPr/>
-        <w:t xml:space="preserve"> Implemented discrimination, calibration, recalibration, decision curves and resampling against a synthetic oracle; demonstrated threshold-decision differences between predictors with identical AUC.</w:t>
-      </w:r>
-    </w:p>
-    <w:p>
-      <w:pPr>
-        <w:pStyle w:val="Heading1"/>
-      </w:pPr>
-      <w:r>
-        <w:rPr/>
-        <w:t>Publications and acknowledged contributions</w:t>
-      </w:r>
-    </w:p>
-    <w:p>
-      <w:pPr>
-        <w:pStyle w:val="Bullet"/>
-        <w:numPr>
-          <w:ilvl w:val="0"/>
-          <w:numId w:val="1027"/>
-        </w:numPr>
-        <w:ind w:left="202" w:hanging="202"/>
-      </w:pPr>
-      <w:r>
-        <w:rPr>
-          <w:b/>
-        </w:rPr>
-        <w:t>Acknowledged contributor:</w:t>
-      </w:r>
-      <w:r>
-        <w:rPr/>
-        <w:t xml:space="preserve"> developed data extraction and normalization programs for the study dataset in Osterhage KP, Hser YI, Mooney LJ, Sherman S, Saxon AJ, Ledgerwood M, Holtzer CC, Gehring MA, Clingan SE, Curtis ME, Baldwin LM. Identifying patients with opioid use disorder using International Classification of Diseases (ICD) codes: challenges and opportunities. </w:t>
-      </w:r>
-      <w:r>
-        <w:rPr>
-          <w:i/>
-        </w:rPr>
-        <w:t>Addiction</w:t>
-      </w:r>
-      <w:r>
-        <w:rPr/>
-        <w:t xml:space="preserve">. 2024;119(1):160-168. </w:t>
-      </w:r>
-      <w:hyperlink r:id="rId58">
-        <w:r>
-          <w:rPr>
-            <w:color w:val="154D66"/>
-          </w:rPr>
-          <w:t>doi:10.1111/add.16338</w:t>
-        </w:r>
-      </w:hyperlink>
-      <w:r>
-        <w:rPr/>
-        <w:t>.</w:t>
-      </w:r>
-    </w:p>
-    <w:p>
-      <w:pPr>
-        <w:pStyle w:val="Bullet"/>
-        <w:numPr>
-          <w:ilvl w:val="0"/>
-          <w:numId w:val="1027"/>
-        </w:numPr>
-        <w:ind w:left="202" w:hanging="202"/>
-      </w:pPr>
-      <w:r>
-        <w:rPr/>
-        <w:t xml:space="preserve">Ben-Avie M, Rosenwald L, Depastino R, Iben P. How can we help young adults with autism thrive in the workplace? </w:t>
-      </w:r>
-      <w:r>
-        <w:rPr>
-          <w:i/>
-        </w:rPr>
-        <w:t>The Conversation</w:t>
-      </w:r>
-      <w:r>
-        <w:rPr/>
-        <w:t>, 2016.</w:t>
+        <w:t>AI evaluation:</w:t>
+      </w:r>
+      <w:r>
+        <w:rPr/>
+        <w:t xml:space="preserve"> numeric grounding, provenance auditing, retrieval evaluation, model comparison, synthetic-oracle checks and reproducibility testing.</w:t>
       </w:r>
     </w:p>
     <w:p>

</xml_diff>